<commit_message>
Rewrite QR summary in McMaster business voice
</commit_message>
<xml_diff>
--- a/QR_Code_Visit_Summary.docx
+++ b/QR_Code_Visit_Summary.docx
@@ -4,28 +4,66 @@
   <w:body>
     <w:p>
       <w:pPr>
-        <w:spacing w:after="0"/>
+        <w:spacing w:after="40"/>
       </w:pPr>
       <w:r>
         <w:rPr>
           <w:b/>
-          <w:color w:val="1F4E79"/>
-          <w:sz w:val="40"/>
+          <w:sz w:val="32"/>
+          <w:u w:val="single"/>
         </w:rPr>
-        <w:t>QR Code Scan Performance</w:t>
+        <w:t>QR Codes on Prepacks</w:t>
       </w:r>
     </w:p>
     <w:p>
       <w:pPr>
-        <w:spacing w:after="240"/>
+        <w:spacing w:after="280"/>
       </w:pPr>
       <w:r>
         <w:rPr>
           <w:i/>
-          <w:color w:val="666666"/>
-          <w:sz w:val="21"/>
+          <w:sz w:val="22"/>
         </w:rPr>
-        <w:t>January 21 – May 28, 2026   |   172 customer scans   |   Prepacks (codeid=4)</w:t>
+        <w:t>January 21 – May 28, 2026   |   172 customer scans</w:t>
+      </w:r>
+    </w:p>
+    <w:p>
+      <w:pPr>
+        <w:spacing w:before="0" w:after="80"/>
+      </w:pPr>
+      <w:r>
+        <w:rPr>
+          <w:b/>
+          <w:sz w:val="26"/>
+          <w:u w:val="single"/>
+        </w:rPr>
+        <w:t>Background</w:t>
+      </w:r>
+    </w:p>
+    <w:p>
+      <w:pPr>
+        <w:spacing w:before="0" w:after="80"/>
+      </w:pPr>
+      <w:r>
+        <w:rPr>
+          <w:b w:val="0"/>
+          <w:i w:val="0"/>
+          <w:sz w:val="22"/>
+        </w:rPr>
+        <w:t>Earlier this year, Prepacks began shipping with modern McMaster-Carr branding and a QR code on every label. The code takes customers directly to the part's product detail page on McMaster.com. We added the code to make reordering easier for customers who already had the part in hand.</w:t>
+      </w:r>
+    </w:p>
+    <w:p>
+      <w:pPr>
+        <w:spacing w:before="0" w:after="80"/>
+      </w:pPr>
+      <w:r>
+        <w:rPr>
+          <w:b w:val="0"/>
+          <w:i w:val="0"/>
+          <w:sz w:val="22"/>
+        </w:rPr>
+        <w:t>This is the first read on how that's playing out. We pulled every visit to a Prepack QR URL between January 21 and May 28, 2026 — 172 customer scans in total — and looked at who scanned, what they did, and which parts pulled the scans.</w:t>
       </w:r>
     </w:p>
     <w:p>
@@ -35,36 +73,73 @@
       <w:r>
         <w:rPr>
           <w:b/>
-          <w:color w:val="1F4E79"/>
-          <w:sz w:val="30"/>
+          <w:sz w:val="26"/>
+          <w:u w:val="single"/>
         </w:rPr>
-        <w:t>Overview</w:t>
+        <w:t>How we measured it</w:t>
       </w:r>
     </w:p>
     <w:p>
       <w:pPr>
-        <w:spacing w:after="80"/>
+        <w:spacing w:before="0" w:after="80"/>
       </w:pPr>
       <w:r>
         <w:rPr>
           <w:b w:val="0"/>
           <w:i w:val="0"/>
-          <w:sz w:val="21"/>
+          <w:sz w:val="22"/>
         </w:rPr>
-        <w:t>Prepacks have carried QR codes on their packaging since the start of 2026. Customers scan the code with a phone camera and land directly on the part's McMaster.com product page — no search, no navigation. This report covers the first four months of that traffic and shows who is scanning, what they look at, and which products are pulling repeat scans.</w:t>
+        <w:t>Every Prepack QR code encodes the same URL pattern: the part number in the path and ?mode=qr&amp;codeid=4 as the query string. That signature let us isolate Prepack scans from regular product page traffic.</w:t>
       </w:r>
     </w:p>
     <w:p>
       <w:pPr>
-        <w:spacing w:after="80"/>
+        <w:spacing w:before="0" w:after="80"/>
       </w:pPr>
       <w:r>
         <w:rPr>
           <w:b w:val="0"/>
           <w:i w:val="0"/>
-          <w:sz w:val="21"/>
+          <w:sz w:val="22"/>
         </w:rPr>
-        <w:t>Two findings stand out. First, volume is climbing — weekly scans grew roughly 5× between February and May, with the largest single week (27 scans) occurring May 18. Second, the customers we can identify skew toward small fabrication shops and credit-card buyers. We can also cleanly attribute about half of all scans to a known customer account through IP and visitor-ID triangulation.</w:t>
+        <w:t>Scan data came from the data warehouse and the interactions graph. Two cleaning passes:</w:t>
+      </w:r>
+    </w:p>
+    <w:p>
+      <w:pPr>
+        <w:pStyle w:val="ListBullet"/>
+        <w:spacing w:after="40"/>
+      </w:pPr>
+      <w:r>
+        <w:rPr>
+          <w:sz w:val="22"/>
+        </w:rPr>
+        <w:t>Internal McMaster-Carr scans were removed (test devices, internal IP ranges, and verification activity).</w:t>
+      </w:r>
+    </w:p>
+    <w:p>
+      <w:pPr>
+        <w:pStyle w:val="ListBullet"/>
+        <w:spacing w:after="40"/>
+      </w:pPr>
+      <w:r>
+        <w:rPr>
+          <w:sz w:val="22"/>
+        </w:rPr>
+        <w:t>Duplicate visits and visits with no recorded actions were dropped.</w:t>
+      </w:r>
+    </w:p>
+    <w:p>
+      <w:pPr>
+        <w:spacing w:before="0" w:after="80"/>
+      </w:pPr>
+      <w:r>
+        <w:rPr>
+          <w:b w:val="0"/>
+          <w:i w:val="0"/>
+          <w:sz w:val="22"/>
+        </w:rPr>
+        <w:t>172 unique customer scans remained.</w:t>
       </w:r>
     </w:p>
     <w:p>
@@ -74,147 +149,30 @@
       <w:r>
         <w:rPr>
           <w:b/>
-          <w:color w:val="1F4E79"/>
-          <w:sz w:val="30"/>
+          <w:sz w:val="26"/>
+          <w:u w:val="single"/>
         </w:rPr>
-        <w:t>Background</w:t>
+        <w:t>Scan volume</w:t>
       </w:r>
     </w:p>
     <w:p>
       <w:pPr>
-        <w:spacing w:after="80"/>
+        <w:spacing w:before="0" w:after="80"/>
       </w:pPr>
       <w:r>
         <w:rPr>
           <w:b w:val="0"/>
           <w:i w:val="0"/>
-          <w:sz w:val="21"/>
+          <w:sz w:val="22"/>
         </w:rPr>
-        <w:t>Each QR code on a Prepack encodes a McMaster.com URL with two parameters: a part number in the path and a query string identifying the code type. Prepack codes use codeid=4 (e.g. mcmaster.com/91251A242/?mode=qr&amp;codeid=4). When scanned, the customer is taken straight to that part's product page. There is no intermediate landing screen and no login required.</w:t>
-      </w:r>
-    </w:p>
-    <w:p>
-      <w:pPr>
-        <w:spacing w:after="80"/>
-      </w:pPr>
-      <w:r>
-        <w:rPr>
-          <w:b w:val="0"/>
-          <w:i w:val="0"/>
-          <w:sz w:val="21"/>
-        </w:rPr>
-        <w:t>Codeid=4 is reserved for Prepack packaging. Other codeid values exist for separate programs (codeid=2 covers the assortment kits, for example), and those are not included here.</w:t>
-      </w:r>
-    </w:p>
-    <w:p>
-      <w:pPr>
-        <w:spacing w:before="280" w:after="80"/>
-      </w:pPr>
-      <w:r>
-        <w:rPr>
-          <w:b/>
-          <w:color w:val="1F4E79"/>
-          <w:sz w:val="30"/>
-        </w:rPr>
-        <w:t>Methodology</w:t>
-      </w:r>
-    </w:p>
-    <w:p>
-      <w:pPr>
-        <w:spacing w:after="80"/>
-      </w:pPr>
-      <w:r>
-        <w:rPr>
-          <w:b w:val="0"/>
-          <w:i w:val="0"/>
-          <w:sz w:val="21"/>
-        </w:rPr>
-        <w:t>We pulled every recorded visit where the landing URL contained mode=qr and codeid=4 between January 21 and May 28, 2026, using the DigitalAnalytics data warehouse (search_source and visit_source tables) and the Neo4j interactions graph for event-level detail.</w:t>
-      </w:r>
-    </w:p>
-    <w:p>
-      <w:pPr>
-        <w:spacing w:after="80"/>
-      </w:pPr>
-      <w:r>
-        <w:rPr>
-          <w:b w:val="0"/>
-          <w:i w:val="0"/>
-          <w:sz w:val="21"/>
-        </w:rPr>
-        <w:t>Two filtering passes were applied before analysis:</w:t>
-      </w:r>
-    </w:p>
-    <w:p>
-      <w:pPr>
-        <w:pStyle w:val="ListBullet"/>
-        <w:spacing w:after="40"/>
-      </w:pPr>
-      <w:r/>
-      <w:r>
-        <w:rPr>
-          <w:sz w:val="21"/>
-        </w:rPr>
-        <w:t>Internal McMaster-Carr traffic was removed by stripping known internal IP ranges and test devices, leaving only legitimate customer scans.</w:t>
-      </w:r>
-    </w:p>
-    <w:p>
-      <w:pPr>
-        <w:pStyle w:val="ListBullet"/>
-        <w:spacing w:after="40"/>
-      </w:pPr>
-      <w:r/>
-      <w:r>
-        <w:rPr>
-          <w:sz w:val="21"/>
-        </w:rPr>
-        <w:t>Duplicate visits and visits with no recorded events were de-duplicated against the visit_id key.</w:t>
-      </w:r>
-    </w:p>
-    <w:p>
-      <w:pPr>
-        <w:spacing w:after="80"/>
-      </w:pPr>
-      <w:r>
-        <w:rPr>
-          <w:b w:val="0"/>
-          <w:i w:val="0"/>
-          <w:sz w:val="21"/>
-        </w:rPr>
-        <w:t>After cleaning, 172 unique customer scans remained.</w:t>
-      </w:r>
-    </w:p>
-    <w:p>
-      <w:pPr>
-        <w:spacing w:before="280" w:after="80"/>
-      </w:pPr>
-      <w:r>
-        <w:rPr>
-          <w:b/>
-          <w:color w:val="1F4E79"/>
-          <w:sz w:val="30"/>
-        </w:rPr>
-        <w:t>Volume Trend</w:t>
-      </w:r>
-    </w:p>
-    <w:p>
-      <w:pPr>
-        <w:spacing w:after="80"/>
-      </w:pPr>
-      <w:r>
-        <w:rPr>
-          <w:b w:val="0"/>
-          <w:i w:val="0"/>
-          <w:sz w:val="21"/>
-        </w:rPr>
-        <w:t>Scan volume grew steadily through the spring. Single-digit weeks in January and February gave way to double-digit weeks starting late March, with the strongest period in May.</w:t>
+        <w:t>Volume grew steadily through the spring. February averaged roughly three scans per week. By May, weekly scans were averaging around seventeen, with a high of twenty-seven the week of May 18.</w:t>
       </w:r>
     </w:p>
     <w:p>
       <w:r>
         <w:drawing>
           <wp:inline xmlns:a="http://schemas.openxmlformats.org/drawingml/2006/main" xmlns:pic="http://schemas.openxmlformats.org/drawingml/2006/picture">
-            <wp:extent cx="6126480" cy="2406504"/>
+            <wp:extent cx="5943600" cy="2334668"/>
             <wp:docPr id="1" name="Picture 1"/>
             <wp:cNvGraphicFramePr>
               <a:graphicFrameLocks noChangeAspect="1"/>
@@ -235,7 +193,7 @@
                   <pic:spPr>
                     <a:xfrm>
                       <a:off x="0" y="0"/>
-                      <a:ext cx="6126480" cy="2406504"/>
+                      <a:ext cx="5943600" cy="2334668"/>
                     </a:xfrm>
                     <a:prstGeom prst="rect"/>
                   </pic:spPr>
@@ -253,75 +211,36 @@
       <w:r>
         <w:rPr>
           <w:b/>
-          <w:color w:val="1F4E79"/>
-          <w:sz w:val="30"/>
+          <w:sz w:val="26"/>
+          <w:u w:val="single"/>
         </w:rPr>
-        <w:t>Customer Identification</w:t>
+        <w:t>Who is scanning</w:t>
       </w:r>
     </w:p>
     <w:p>
       <w:pPr>
-        <w:spacing w:after="80"/>
+        <w:spacing w:before="0" w:after="80"/>
       </w:pPr>
       <w:r>
         <w:rPr>
           <w:b w:val="0"/>
           <w:i w:val="0"/>
-          <w:sz w:val="21"/>
+          <w:sz w:val="22"/>
         </w:rPr>
-        <w:t>QR scans land on a public URL, so we don't get a logged-in customer ID by default. To identify who is scanning, we triangulate across three signals available at the moment of the scan:</w:t>
+        <w:t>Most customers who scan a QR code aren't logged in at the moment of the scan, so we don't get a clean customer ID for free. To work around this, we matched scans to known customers using three signals: the visitor ID stored in their browser, the session ID McMaster tracks for that visit, and the IP address the scan came from.</w:t>
       </w:r>
     </w:p>
     <w:p>
       <w:pPr>
-        <w:pStyle w:val="ListBullet"/>
-        <w:spacing w:after="40"/>
-      </w:pPr>
-      <w:r/>
-      <w:r>
-        <w:rPr>
-          <w:sz w:val="21"/>
-        </w:rPr>
-        <w:t>Visitor ID — McMaster's persistent web cookie, present on most modern browser sessions.</w:t>
-      </w:r>
-    </w:p>
-    <w:p>
-      <w:pPr>
-        <w:pStyle w:val="ListBullet"/>
-        <w:spacing w:after="40"/>
-      </w:pPr>
-      <w:r/>
-      <w:r>
-        <w:rPr>
-          <w:sz w:val="21"/>
-        </w:rPr>
-        <w:t>Browse ID — a session-level identifier that can be matched against prior contact activity.</w:t>
-      </w:r>
-    </w:p>
-    <w:p>
-      <w:pPr>
-        <w:pStyle w:val="ListBullet"/>
-        <w:spacing w:after="40"/>
-      </w:pPr>
-      <w:r/>
-      <w:r>
-        <w:rPr>
-          <w:sz w:val="21"/>
-        </w:rPr>
-        <w:t>Client IP address — when the IP matches a known CMF (e.g., a shop with a static business IP), we can attribute the scan to that account.</w:t>
-      </w:r>
-    </w:p>
-    <w:p>
-      <w:pPr>
-        <w:spacing w:after="80"/>
+        <w:spacing w:before="0" w:after="80"/>
       </w:pPr>
       <w:r>
         <w:rPr>
           <w:b w:val="0"/>
           <w:i w:val="0"/>
-          <w:sz w:val="21"/>
+          <w:sz w:val="22"/>
         </w:rPr>
-        <w:t>Across the 172 scans, 90 (52%) triangulated to at least one known customer. The other 82 were either first-time mobile visitors with no prior account activity, or arrived from residential carrier IPs that could not be tied to an account.</w:t>
+        <w:t>Roughly half — 90 of the 172 scans — matched to a known customer this way. Most were small fabrication shops and credit-card buyers. The other half were first-time mobile visitors with no prior account history, or came from residential carrier IPs we couldn't tie to a specific account.</w:t>
       </w:r>
     </w:p>
     <w:p>
@@ -331,66 +250,75 @@
       <w:r>
         <w:rPr>
           <w:b/>
-          <w:color w:val="1F4E79"/>
-          <w:sz w:val="30"/>
+          <w:sz w:val="26"/>
+          <w:u w:val="single"/>
         </w:rPr>
-        <w:t>What the Visits Look Like</w:t>
+        <w:t>What customers do after they scan</w:t>
       </w:r>
     </w:p>
     <w:p>
       <w:pPr>
-        <w:spacing w:after="80"/>
+        <w:spacing w:before="0" w:after="80"/>
       </w:pPr>
       <w:r>
         <w:rPr>
           <w:b w:val="0"/>
           <w:i w:val="0"/>
-          <w:sz w:val="21"/>
+          <w:sz w:val="22"/>
         </w:rPr>
-        <w:t>Most scans are short. About 69% of customers landed on the product page and left without further interaction — typical behavior for QR codes in physical environments, where curious or accidental scans are common. The remaining 31% explored the site further.</w:t>
+        <w:t>Most scans are short. About seven in ten customers land on the part page and leave without further interaction — typical behavior for QR codes in physical environments, where curious or accidental scans happen often.</w:t>
+      </w:r>
+    </w:p>
+    <w:p>
+      <w:pPr>
+        <w:spacing w:before="0" w:after="80"/>
+      </w:pPr>
+      <w:r>
+        <w:rPr>
+          <w:b w:val="0"/>
+          <w:i w:val="0"/>
+          <w:sz w:val="22"/>
+        </w:rPr>
+        <w:t>The remaining 31% went deeper. They filtered specs, expanded images, opened sibling parts, and revisited the scanned product. Three placed items in their order pad. One downloaded a CAD file.</w:t>
       </w:r>
     </w:p>
     <w:tbl>
       <w:tblPr>
-        <w:tblStyle w:val="LightGrid-Accent1"/>
+        <w:tblStyle w:val="TableGrid"/>
         <w:tblW w:type="auto" w:w="0"/>
         <w:tblLook w:firstColumn="1" w:firstRow="1" w:lastColumn="0" w:lastRow="0" w:noHBand="0" w:noVBand="1" w:val="04A0"/>
       </w:tblPr>
       <w:tblGrid>
-        <w:gridCol w:w="3216"/>
-        <w:gridCol w:w="3216"/>
-        <w:gridCol w:w="3216"/>
+        <w:gridCol w:w="3120"/>
+        <w:gridCol w:w="3120"/>
+        <w:gridCol w:w="3120"/>
       </w:tblGrid>
       <w:tr>
         <w:tc>
           <w:tcPr>
-            <w:tcW w:type="dxa" w:w="3600"/>
-            <w:shd w:val="clear" w:color="auto" w:fill="2C5282"/>
+            <w:tcW w:type="dxa" w:w="3120"/>
           </w:tcPr>
           <w:p>
             <w:r/>
             <w:r>
               <w:rPr>
                 <w:b/>
-                <w:color w:val="FFFFFF"/>
-                <w:sz w:val="21"/>
+                <w:sz w:val="22"/>
               </w:rPr>
-              <w:t>Engagement</w:t>
+              <w:t>Visit length</w:t>
             </w:r>
           </w:p>
         </w:tc>
         <w:tc>
           <w:tcPr>
-            <w:tcW w:type="dxa" w:w="1584"/>
-            <w:shd w:val="clear" w:color="auto" w:fill="2C5282"/>
+            <w:tcW w:type="dxa" w:w="3120"/>
           </w:tcPr>
           <w:p>
             <w:r/>
             <w:r>
               <w:rPr>
                 <w:b/>
-                <w:color w:val="FFFFFF"/>
-                <w:sz w:val="21"/>
+                <w:sz w:val="22"/>
               </w:rPr>
               <w:t>Visits</w:t>
             </w:r>
@@ -398,16 +326,14 @@
         </w:tc>
         <w:tc>
           <w:tcPr>
-            <w:tcW w:type="dxa" w:w="2160"/>
-            <w:shd w:val="clear" w:color="auto" w:fill="2C5282"/>
+            <w:tcW w:type="dxa" w:w="3120"/>
           </w:tcPr>
           <w:p>
             <w:r/>
             <w:r>
               <w:rPr>
                 <w:b/>
-                <w:color w:val="FFFFFF"/>
-                <w:sz w:val="21"/>
+                <w:sz w:val="22"/>
               </w:rPr>
               <w:t>% of total</w:t>
             </w:r>
@@ -417,27 +343,27 @@
       <w:tr>
         <w:tc>
           <w:tcPr>
-            <w:tcW w:type="dxa" w:w="3600"/>
+            <w:tcW w:type="dxa" w:w="3120"/>
           </w:tcPr>
           <w:p>
             <w:r/>
             <w:r>
               <w:rPr>
-                <w:sz w:val="20"/>
+                <w:sz w:val="22"/>
               </w:rPr>
-              <w:t>1 action — landing only</w:t>
+              <w:t>Single action (landing only)</w:t>
             </w:r>
           </w:p>
         </w:tc>
         <w:tc>
           <w:tcPr>
-            <w:tcW w:type="dxa" w:w="1584"/>
+            <w:tcW w:type="dxa" w:w="3120"/>
           </w:tcPr>
           <w:p>
             <w:r/>
             <w:r>
               <w:rPr>
-                <w:sz w:val="20"/>
+                <w:sz w:val="22"/>
               </w:rPr>
               <w:t>119</w:t>
             </w:r>
@@ -445,15 +371,15 @@
         </w:tc>
         <w:tc>
           <w:tcPr>
-            <w:tcW w:type="dxa" w:w="2160"/>
+            <w:tcW w:type="dxa" w:w="3120"/>
           </w:tcPr>
           <w:p>
             <w:r/>
             <w:r>
               <w:rPr>
-                <w:sz w:val="20"/>
+                <w:sz w:val="22"/>
               </w:rPr>
-              <w:t>69.2%</w:t>
+              <w:t>69%</w:t>
             </w:r>
           </w:p>
         </w:tc>
@@ -461,27 +387,27 @@
       <w:tr>
         <w:tc>
           <w:tcPr>
-            <w:tcW w:type="dxa" w:w="3600"/>
+            <w:tcW w:type="dxa" w:w="3120"/>
           </w:tcPr>
           <w:p>
             <w:r/>
             <w:r>
               <w:rPr>
-                <w:sz w:val="20"/>
+                <w:sz w:val="22"/>
               </w:rPr>
-              <w:t>2 to 5 actions</w:t>
+              <w:t>2–5 actions</w:t>
             </w:r>
           </w:p>
         </w:tc>
         <w:tc>
           <w:tcPr>
-            <w:tcW w:type="dxa" w:w="1584"/>
+            <w:tcW w:type="dxa" w:w="3120"/>
           </w:tcPr>
           <w:p>
             <w:r/>
             <w:r>
               <w:rPr>
-                <w:sz w:val="20"/>
+                <w:sz w:val="22"/>
               </w:rPr>
               <w:t>41</w:t>
             </w:r>
@@ -489,15 +415,15 @@
         </w:tc>
         <w:tc>
           <w:tcPr>
-            <w:tcW w:type="dxa" w:w="2160"/>
+            <w:tcW w:type="dxa" w:w="3120"/>
           </w:tcPr>
           <w:p>
             <w:r/>
             <w:r>
               <w:rPr>
-                <w:sz w:val="20"/>
+                <w:sz w:val="22"/>
               </w:rPr>
-              <w:t>23.8%</w:t>
+              <w:t>24%</w:t>
             </w:r>
           </w:p>
         </w:tc>
@@ -505,27 +431,27 @@
       <w:tr>
         <w:tc>
           <w:tcPr>
-            <w:tcW w:type="dxa" w:w="3600"/>
+            <w:tcW w:type="dxa" w:w="3120"/>
           </w:tcPr>
           <w:p>
             <w:r/>
             <w:r>
               <w:rPr>
-                <w:sz w:val="20"/>
+                <w:sz w:val="22"/>
               </w:rPr>
-              <w:t>6 to 20 actions</w:t>
+              <w:t>6+ actions</w:t>
             </w:r>
           </w:p>
         </w:tc>
         <w:tc>
           <w:tcPr>
-            <w:tcW w:type="dxa" w:w="1584"/>
+            <w:tcW w:type="dxa" w:w="3120"/>
           </w:tcPr>
           <w:p>
             <w:r/>
             <w:r>
               <w:rPr>
-                <w:sz w:val="20"/>
+                <w:sz w:val="22"/>
               </w:rPr>
               <w:t>12</w:t>
             </w:r>
@@ -533,59 +459,15 @@
         </w:tc>
         <w:tc>
           <w:tcPr>
-            <w:tcW w:type="dxa" w:w="2160"/>
+            <w:tcW w:type="dxa" w:w="3120"/>
           </w:tcPr>
           <w:p>
             <w:r/>
             <w:r>
               <w:rPr>
-                <w:sz w:val="20"/>
+                <w:sz w:val="22"/>
               </w:rPr>
-              <w:t>7.0%</w:t>
-            </w:r>
-          </w:p>
-        </w:tc>
-      </w:tr>
-      <w:tr>
-        <w:tc>
-          <w:tcPr>
-            <w:tcW w:type="dxa" w:w="3600"/>
-          </w:tcPr>
-          <w:p>
-            <w:r/>
-            <w:r>
-              <w:rPr>
-                <w:sz w:val="20"/>
-              </w:rPr>
-              <w:t>Total</w:t>
-            </w:r>
-          </w:p>
-        </w:tc>
-        <w:tc>
-          <w:tcPr>
-            <w:tcW w:type="dxa" w:w="1584"/>
-          </w:tcPr>
-          <w:p>
-            <w:r/>
-            <w:r>
-              <w:rPr>
-                <w:sz w:val="20"/>
-              </w:rPr>
-              <w:t>172</w:t>
-            </w:r>
-          </w:p>
-        </w:tc>
-        <w:tc>
-          <w:tcPr>
-            <w:tcW w:type="dxa" w:w="2160"/>
-          </w:tcPr>
-          <w:p>
-            <w:r/>
-            <w:r>
-              <w:rPr>
-                <w:sz w:val="20"/>
-              </w:rPr>
-              <w:t>100.0%</w:t>
+              <w:t>7%</w:t>
             </w:r>
           </w:p>
         </w:tc>
@@ -593,53 +475,27 @@
     </w:tbl>
     <w:p>
       <w:pPr>
-        <w:spacing w:after="40"/>
+        <w:spacing w:before="0" w:after="120"/>
       </w:pPr>
       <w:r>
         <w:rPr>
           <w:b w:val="0"/>
           <w:i w:val="0"/>
-          <w:sz w:val="21"/>
+          <w:sz w:val="22"/>
         </w:rPr>
       </w:r>
     </w:p>
     <w:p>
       <w:pPr>
-        <w:spacing w:after="120"/>
+        <w:spacing w:before="0" w:after="80"/>
       </w:pPr>
       <w:r>
         <w:rPr>
           <w:b w:val="0"/>
           <w:i w:val="0"/>
-          <w:sz w:val="21"/>
+          <w:sz w:val="22"/>
         </w:rPr>
-        <w:t>Of the engaged customers, three placed items in their order pad and one downloaded a CAD model. Engaged sessions consistently showed spec filtering, image expansion, and revisits to the scanned part — behavior consistent with active purchase consideration rather than browsing.</w:t>
-      </w:r>
-    </w:p>
-    <w:p>
-      <w:pPr>
-        <w:spacing w:before="200" w:after="40"/>
-      </w:pPr>
-      <w:r>
-        <w:rPr>
-          <w:b/>
-          <w:color w:val="1F4E79"/>
-          <w:sz w:val="24"/>
-        </w:rPr>
-        <w:t>Devices</w:t>
-      </w:r>
-    </w:p>
-    <w:p>
-      <w:pPr>
-        <w:spacing w:after="80"/>
-      </w:pPr>
-      <w:r>
-        <w:rPr>
-          <w:b w:val="0"/>
-          <w:i w:val="0"/>
-          <w:sz w:val="21"/>
-        </w:rPr>
-        <w:t>Mobile phones dominated, as expected. 92% of scans came from a phone (iOS 58%, Android 36%). The remaining 8% came from desktop browsers — typically a person scanning into a phone, then completing the visit on their workstation.</w:t>
+        <w:t>92% of scans came from a phone — about 60% iPhone, 40% Android. The remaining 8% came from desktop browsers, typically a customer scanning into their phone and then continuing on a workstation.</w:t>
       </w:r>
     </w:p>
     <w:p>
@@ -649,65 +505,61 @@
       <w:r>
         <w:rPr>
           <w:b/>
-          <w:color w:val="1F4E79"/>
-          <w:sz w:val="30"/>
+          <w:sz w:val="26"/>
+          <w:u w:val="single"/>
         </w:rPr>
-        <w:t>Parts and Repeat Scans</w:t>
+        <w:t>Which parts get scanned</w:t>
       </w:r>
     </w:p>
     <w:p>
       <w:pPr>
-        <w:spacing w:after="80"/>
+        <w:spacing w:before="0" w:after="80"/>
       </w:pPr>
       <w:r>
         <w:rPr>
           <w:b w:val="0"/>
           <w:i w:val="0"/>
-          <w:sz w:val="21"/>
+          <w:sz w:val="22"/>
         </w:rPr>
-        <w:t>Customers scanned 127 distinct part numbers. Most parts (98 of 127, or 77%) were scanned only once — the long tail you would expect from a broad Prepack catalog. The 29 parts scanned more than once are the most likely candidates for repeat shop-floor use.</w:t>
+        <w:t>Customers scanned 127 different part numbers. Most parts (98 of the 127, or roughly three-quarters) were scanned only once. The parts scanned more than once are the clearest signal that the Prepack QR program is doing what we hoped — landing on a shop floor, getting used to reorder.</w:t>
       </w:r>
     </w:p>
     <w:tbl>
       <w:tblPr>
-        <w:tblStyle w:val="LightGrid-Accent1"/>
+        <w:tblStyle w:val="TableGrid"/>
         <w:tblW w:type="auto" w:w="0"/>
         <w:tblLook w:firstColumn="1" w:firstRow="1" w:lastColumn="0" w:lastRow="0" w:noHBand="0" w:noVBand="1" w:val="04A0"/>
       </w:tblPr>
       <w:tblGrid>
-        <w:gridCol w:w="4824"/>
-        <w:gridCol w:w="4824"/>
+        <w:gridCol w:w="4680"/>
+        <w:gridCol w:w="4680"/>
       </w:tblGrid>
       <w:tr>
         <w:tc>
           <w:tcPr>
-            <w:tcW w:type="dxa" w:w="2880"/>
-            <w:shd w:val="clear" w:color="auto" w:fill="2C5282"/>
+            <w:tcW w:type="dxa" w:w="4680"/>
           </w:tcPr>
           <w:p>
             <w:r/>
             <w:r>
               <w:rPr>
                 <w:b/>
-                <w:color w:val="FFFFFF"/>
-                <w:sz w:val="21"/>
+                <w:sz w:val="22"/>
               </w:rPr>
-              <w:t>Part Number</w:t>
+              <w:t>Part number</w:t>
             </w:r>
           </w:p>
         </w:tc>
         <w:tc>
           <w:tcPr>
-            <w:tcW w:type="dxa" w:w="1440"/>
-            <w:shd w:val="clear" w:color="auto" w:fill="2C5282"/>
+            <w:tcW w:type="dxa" w:w="4680"/>
           </w:tcPr>
           <w:p>
             <w:r/>
             <w:r>
               <w:rPr>
                 <w:b/>
-                <w:color w:val="FFFFFF"/>
-                <w:sz w:val="21"/>
+                <w:sz w:val="22"/>
               </w:rPr>
               <w:t>Scans</w:t>
             </w:r>
@@ -717,13 +569,13 @@
       <w:tr>
         <w:tc>
           <w:tcPr>
-            <w:tcW w:type="dxa" w:w="2880"/>
+            <w:tcW w:type="dxa" w:w="4680"/>
           </w:tcPr>
           <w:p>
             <w:r/>
             <w:r>
               <w:rPr>
-                <w:sz w:val="20"/>
+                <w:sz w:val="22"/>
               </w:rPr>
               <w:t>91251A242</w:t>
             </w:r>
@@ -731,13 +583,13 @@
         </w:tc>
         <w:tc>
           <w:tcPr>
-            <w:tcW w:type="dxa" w:w="1440"/>
+            <w:tcW w:type="dxa" w:w="4680"/>
           </w:tcPr>
           <w:p>
             <w:r/>
             <w:r>
               <w:rPr>
-                <w:sz w:val="20"/>
+                <w:sz w:val="22"/>
               </w:rPr>
               <w:t>5</w:t>
             </w:r>
@@ -747,13 +599,13 @@
       <w:tr>
         <w:tc>
           <w:tcPr>
-            <w:tcW w:type="dxa" w:w="2880"/>
+            <w:tcW w:type="dxa" w:w="4680"/>
           </w:tcPr>
           <w:p>
             <w:r/>
             <w:r>
               <w:rPr>
-                <w:sz w:val="20"/>
+                <w:sz w:val="22"/>
               </w:rPr>
               <w:t>95105A159</w:t>
             </w:r>
@@ -761,13 +613,13 @@
         </w:tc>
         <w:tc>
           <w:tcPr>
-            <w:tcW w:type="dxa" w:w="1440"/>
+            <w:tcW w:type="dxa" w:w="4680"/>
           </w:tcPr>
           <w:p>
             <w:r/>
             <w:r>
               <w:rPr>
-                <w:sz w:val="20"/>
+                <w:sz w:val="22"/>
               </w:rPr>
               <w:t>5</w:t>
             </w:r>
@@ -777,13 +629,13 @@
       <w:tr>
         <w:tc>
           <w:tcPr>
-            <w:tcW w:type="dxa" w:w="2880"/>
+            <w:tcW w:type="dxa" w:w="4680"/>
           </w:tcPr>
           <w:p>
             <w:r/>
             <w:r>
               <w:rPr>
-                <w:sz w:val="20"/>
+                <w:sz w:val="22"/>
               </w:rPr>
               <w:t>7073K332</w:t>
             </w:r>
@@ -791,13 +643,13 @@
         </w:tc>
         <w:tc>
           <w:tcPr>
-            <w:tcW w:type="dxa" w:w="1440"/>
+            <w:tcW w:type="dxa" w:w="4680"/>
           </w:tcPr>
           <w:p>
             <w:r/>
             <w:r>
               <w:rPr>
-                <w:sz w:val="20"/>
+                <w:sz w:val="22"/>
               </w:rPr>
               <w:t>4</w:t>
             </w:r>
@@ -807,13 +659,13 @@
       <w:tr>
         <w:tc>
           <w:tcPr>
-            <w:tcW w:type="dxa" w:w="2880"/>
+            <w:tcW w:type="dxa" w:w="4680"/>
           </w:tcPr>
           <w:p>
             <w:r/>
             <w:r>
               <w:rPr>
-                <w:sz w:val="20"/>
+                <w:sz w:val="22"/>
               </w:rPr>
               <w:t>1095K11</w:t>
             </w:r>
@@ -821,13 +673,13 @@
         </w:tc>
         <w:tc>
           <w:tcPr>
-            <w:tcW w:type="dxa" w:w="1440"/>
+            <w:tcW w:type="dxa" w:w="4680"/>
           </w:tcPr>
           <w:p>
             <w:r/>
             <w:r>
               <w:rPr>
-                <w:sz w:val="20"/>
+                <w:sz w:val="22"/>
               </w:rPr>
               <w:t>3</w:t>
             </w:r>
@@ -837,13 +689,13 @@
       <w:tr>
         <w:tc>
           <w:tcPr>
-            <w:tcW w:type="dxa" w:w="2880"/>
+            <w:tcW w:type="dxa" w:w="4680"/>
           </w:tcPr>
           <w:p>
             <w:r/>
             <w:r>
               <w:rPr>
-                <w:sz w:val="20"/>
+                <w:sz w:val="22"/>
               </w:rPr>
               <w:t>91247A628</w:t>
             </w:r>
@@ -851,13 +703,13 @@
         </w:tc>
         <w:tc>
           <w:tcPr>
-            <w:tcW w:type="dxa" w:w="1440"/>
+            <w:tcW w:type="dxa" w:w="4680"/>
           </w:tcPr>
           <w:p>
             <w:r/>
             <w:r>
               <w:rPr>
-                <w:sz w:val="20"/>
+                <w:sz w:val="22"/>
               </w:rPr>
               <w:t>3</w:t>
             </w:r>
@@ -867,13 +719,13 @@
       <w:tr>
         <w:tc>
           <w:tcPr>
-            <w:tcW w:type="dxa" w:w="2880"/>
+            <w:tcW w:type="dxa" w:w="4680"/>
           </w:tcPr>
           <w:p>
             <w:r/>
             <w:r>
               <w:rPr>
-                <w:sz w:val="20"/>
+                <w:sz w:val="22"/>
               </w:rPr>
               <w:t>92865A546</w:t>
             </w:r>
@@ -881,13 +733,13 @@
         </w:tc>
         <w:tc>
           <w:tcPr>
-            <w:tcW w:type="dxa" w:w="1440"/>
+            <w:tcW w:type="dxa" w:w="4680"/>
           </w:tcPr>
           <w:p>
             <w:r/>
             <w:r>
               <w:rPr>
-                <w:sz w:val="20"/>
+                <w:sz w:val="22"/>
               </w:rPr>
               <w:t>3</w:t>
             </w:r>
@@ -897,13 +749,13 @@
       <w:tr>
         <w:tc>
           <w:tcPr>
-            <w:tcW w:type="dxa" w:w="2880"/>
+            <w:tcW w:type="dxa" w:w="4680"/>
           </w:tcPr>
           <w:p>
             <w:r/>
             <w:r>
               <w:rPr>
-                <w:sz w:val="20"/>
+                <w:sz w:val="22"/>
               </w:rPr>
               <w:t>97467A117</w:t>
             </w:r>
@@ -911,13 +763,13 @@
         </w:tc>
         <w:tc>
           <w:tcPr>
-            <w:tcW w:type="dxa" w:w="1440"/>
+            <w:tcW w:type="dxa" w:w="4680"/>
           </w:tcPr>
           <w:p>
             <w:r/>
             <w:r>
               <w:rPr>
-                <w:sz w:val="20"/>
+                <w:sz w:val="22"/>
               </w:rPr>
               <w:t>3</w:t>
             </w:r>
@@ -927,13 +779,13 @@
       <w:tr>
         <w:tc>
           <w:tcPr>
-            <w:tcW w:type="dxa" w:w="2880"/>
+            <w:tcW w:type="dxa" w:w="4680"/>
           </w:tcPr>
           <w:p>
             <w:r/>
             <w:r>
               <w:rPr>
-                <w:sz w:val="20"/>
+                <w:sz w:val="22"/>
               </w:rPr>
               <w:t>92865A543</w:t>
             </w:r>
@@ -941,13 +793,13 @@
         </w:tc>
         <w:tc>
           <w:tcPr>
-            <w:tcW w:type="dxa" w:w="1440"/>
+            <w:tcW w:type="dxa" w:w="4680"/>
           </w:tcPr>
           <w:p>
             <w:r/>
             <w:r>
               <w:rPr>
-                <w:sz w:val="20"/>
+                <w:sz w:val="22"/>
               </w:rPr>
               <w:t>3</w:t>
             </w:r>
@@ -957,13 +809,13 @@
       <w:tr>
         <w:tc>
           <w:tcPr>
-            <w:tcW w:type="dxa" w:w="2880"/>
+            <w:tcW w:type="dxa" w:w="4680"/>
           </w:tcPr>
           <w:p>
             <w:r/>
             <w:r>
               <w:rPr>
-                <w:sz w:val="20"/>
+                <w:sz w:val="22"/>
               </w:rPr>
               <w:t>97802A316</w:t>
             </w:r>
@@ -971,13 +823,13 @@
         </w:tc>
         <w:tc>
           <w:tcPr>
-            <w:tcW w:type="dxa" w:w="1440"/>
+            <w:tcW w:type="dxa" w:w="4680"/>
           </w:tcPr>
           <w:p>
             <w:r/>
             <w:r>
               <w:rPr>
-                <w:sz w:val="20"/>
+                <w:sz w:val="22"/>
               </w:rPr>
               <w:t>3</w:t>
             </w:r>
@@ -987,13 +839,13 @@
       <w:tr>
         <w:tc>
           <w:tcPr>
-            <w:tcW w:type="dxa" w:w="2880"/>
+            <w:tcW w:type="dxa" w:w="4680"/>
           </w:tcPr>
           <w:p>
             <w:r/>
             <w:r>
               <w:rPr>
-                <w:sz w:val="20"/>
+                <w:sz w:val="22"/>
               </w:rPr>
               <w:t>91400A196</w:t>
             </w:r>
@@ -1001,13 +853,13 @@
         </w:tc>
         <w:tc>
           <w:tcPr>
-            <w:tcW w:type="dxa" w:w="1440"/>
+            <w:tcW w:type="dxa" w:w="4680"/>
           </w:tcPr>
           <w:p>
             <w:r/>
             <w:r>
               <w:rPr>
-                <w:sz w:val="20"/>
+                <w:sz w:val="22"/>
               </w:rPr>
               <w:t>3</w:t>
             </w:r>
@@ -1017,13 +869,13 @@
       <w:tr>
         <w:tc>
           <w:tcPr>
-            <w:tcW w:type="dxa" w:w="2880"/>
+            <w:tcW w:type="dxa" w:w="4680"/>
           </w:tcPr>
           <w:p>
             <w:r/>
             <w:r>
               <w:rPr>
-                <w:sz w:val="20"/>
+                <w:sz w:val="22"/>
               </w:rPr>
               <w:t>91000A469</w:t>
             </w:r>
@@ -1031,13 +883,13 @@
         </w:tc>
         <w:tc>
           <w:tcPr>
-            <w:tcW w:type="dxa" w:w="1440"/>
+            <w:tcW w:type="dxa" w:w="4680"/>
           </w:tcPr>
           <w:p>
             <w:r/>
             <w:r>
               <w:rPr>
-                <w:sz w:val="20"/>
+                <w:sz w:val="22"/>
               </w:rPr>
               <w:t>3</w:t>
             </w:r>
@@ -1047,40 +899,15 @@
     </w:tbl>
     <w:p>
       <w:pPr>
-        <w:spacing w:after="40"/>
-      </w:pPr>
-      <w:r>
-        <w:rPr>
-          <w:b w:val="0"/>
-          <w:i w:val="0"/>
-          <w:sz w:val="21"/>
-        </w:rPr>
-      </w:r>
-    </w:p>
-    <w:p>
-      <w:pPr>
-        <w:spacing w:after="80"/>
-      </w:pPr>
-      <w:r>
-        <w:rPr>
-          <w:b w:val="0"/>
-          <w:i w:val="0"/>
-          <w:sz w:val="21"/>
-        </w:rPr>
-        <w:t>Parts with three or more scans suggest the QR code is sitting somewhere it gets used regularly — a shelf label, a maintenance bin, or a tool crib. These are the cleanest signals that the Prepack QR program is being used as intended.</w:t>
-      </w:r>
-    </w:p>
-    <w:p>
-      <w:pPr>
         <w:spacing w:before="280" w:after="80"/>
       </w:pPr>
       <w:r>
         <w:rPr>
           <w:b/>
-          <w:color w:val="1F4E79"/>
-          <w:sz w:val="30"/>
+          <w:sz w:val="26"/>
+          <w:u w:val="single"/>
         </w:rPr>
-        <w:t>Key Findings</w:t>
+        <w:t>Takeaways</w:t>
       </w:r>
     </w:p>
     <w:p>
@@ -1088,12 +915,11 @@
         <w:pStyle w:val="ListBullet"/>
         <w:spacing w:after="40"/>
       </w:pPr>
-      <w:r/>
       <w:r>
         <w:rPr>
-          <w:sz w:val="21"/>
+          <w:sz w:val="22"/>
         </w:rPr>
-        <w:t>Volume is growing. Weekly scans climbed roughly 5× between February and May. The trend is consistent enough that we should expect continued growth into Q3 as more Prepacks ship.</w:t>
+        <w:t>Volume is climbing. Weekly scans are roughly five times higher in May than in February. We expect continued growth as more Prepacks ship.</w:t>
       </w:r>
     </w:p>
     <w:p>
@@ -1101,12 +927,11 @@
         <w:pStyle w:val="ListBullet"/>
         <w:spacing w:after="40"/>
       </w:pPr>
-      <w:r/>
       <w:r>
         <w:rPr>
-          <w:sz w:val="21"/>
+          <w:sz w:val="22"/>
         </w:rPr>
-        <w:t>Most scans don't lead to immediate action, but that's normal. The 69% landing-only rate matches benchmarks for physical QR codes. The 31% engagement rate among the rest is healthy and includes real purchase signals.</w:t>
+        <w:t>The customers we can identify are exactly who we hoped to reach — small shops and credit-card buyers reordering specific parts.</w:t>
       </w:r>
     </w:p>
     <w:p>
@@ -1114,12 +939,11 @@
         <w:pStyle w:val="ListBullet"/>
         <w:spacing w:after="40"/>
       </w:pPr>
-      <w:r/>
       <w:r>
         <w:rPr>
-          <w:sz w:val="21"/>
+          <w:sz w:val="22"/>
         </w:rPr>
-        <w:t>We can identify the customer behind about half of all scans. The remaining half are mobile visitors with no prior account history — a growing audience for future engagement.</w:t>
+        <w:t>Most scans are short, which is normal for physical QR codes. The 31% who engage show real purchase intent.</w:t>
       </w:r>
     </w:p>
     <w:p>
@@ -1127,147 +951,16 @@
         <w:pStyle w:val="ListBullet"/>
         <w:spacing w:after="40"/>
       </w:pPr>
-      <w:r/>
       <w:r>
         <w:rPr>
-          <w:sz w:val="21"/>
+          <w:sz w:val="22"/>
         </w:rPr>
-        <w:t>Repeat-scan parts point at where the codes are working. The 29 parts scanned more than once indicate physical placement that's getting reused — shop floors, maintenance areas, or known reorder points.</w:t>
-      </w:r>
-    </w:p>
-    <w:p>
-      <w:pPr>
-        <w:pStyle w:val="ListBullet"/>
-        <w:spacing w:after="40"/>
-      </w:pPr>
-      <w:r/>
-      <w:r>
-        <w:rPr>
-          <w:sz w:val="21"/>
-        </w:rPr>
-        <w:t>Mobile-first design is essential. 92% of scans came from a phone. Any follow-up actions we want customers to take from a QR landing page need to work cleanly on a small screen.</w:t>
-      </w:r>
-    </w:p>
-    <w:p>
-      <w:pPr>
-        <w:spacing w:before="280" w:after="80"/>
-      </w:pPr>
-      <w:r>
-        <w:rPr>
-          <w:b/>
-          <w:color w:val="1F4E79"/>
-          <w:sz w:val="30"/>
-        </w:rPr>
-        <w:t>Appendix: Definitions</w:t>
-      </w:r>
-    </w:p>
-    <w:p>
-      <w:pPr>
-        <w:spacing w:after="20"/>
-      </w:pPr>
-      <w:r>
-        <w:rPr>
-          <w:b/>
-          <w:i w:val="0"/>
-          <w:sz w:val="21"/>
-        </w:rPr>
-        <w:t>Visit</w:t>
-      </w:r>
-    </w:p>
-    <w:p>
-      <w:pPr>
-        <w:spacing w:after="80"/>
-      </w:pPr>
-      <w:r>
-        <w:rPr>
-          <w:b w:val="0"/>
-          <w:i w:val="0"/>
-          <w:sz w:val="20"/>
-        </w:rPr>
-        <w:t>A continuous browser session ending after 4 hours of inactivity, scoped to a single visit_id.</w:t>
-      </w:r>
-    </w:p>
-    <w:p>
-      <w:pPr>
-        <w:spacing w:after="20"/>
-      </w:pPr>
-      <w:r>
-        <w:rPr>
-          <w:b/>
-          <w:i w:val="0"/>
-          <w:sz w:val="21"/>
-        </w:rPr>
-        <w:t>Engagement (user_action_engagement_count)</w:t>
-      </w:r>
-    </w:p>
-    <w:p>
-      <w:pPr>
-        <w:spacing w:after="80"/>
-      </w:pPr>
-      <w:r>
-        <w:rPr>
-          <w:b w:val="0"/>
-          <w:i w:val="0"/>
-          <w:sz w:val="20"/>
-        </w:rPr>
-        <w:t>The number of deliberate user actions taken during a visit. Excludes passive events like page scrolls or banner impressions.</w:t>
-      </w:r>
-    </w:p>
-    <w:p>
-      <w:pPr>
-        <w:spacing w:after="20"/>
-      </w:pPr>
-      <w:r>
-        <w:rPr>
-          <w:b/>
-          <w:i w:val="0"/>
-          <w:sz w:val="21"/>
-        </w:rPr>
-        <w:t>Triangulation</w:t>
-      </w:r>
-    </w:p>
-    <w:p>
-      <w:pPr>
-        <w:spacing w:after="80"/>
-      </w:pPr>
-      <w:r>
-        <w:rPr>
-          <w:b w:val="0"/>
-          <w:i w:val="0"/>
-          <w:sz w:val="20"/>
-        </w:rPr>
-        <w:t>Inferring the customer behind an anonymous scan by combining browser cookie (visitor_id), session identifier (browse_id), and client IP against known CMF records.</w:t>
-      </w:r>
-    </w:p>
-    <w:p>
-      <w:pPr>
-        <w:spacing w:after="20"/>
-      </w:pPr>
-      <w:r>
-        <w:rPr>
-          <w:b/>
-          <w:i w:val="0"/>
-          <w:sz w:val="21"/>
-        </w:rPr>
-        <w:t>Prepack</w:t>
-      </w:r>
-    </w:p>
-    <w:p>
-      <w:pPr>
-        <w:spacing w:after="80"/>
-      </w:pPr>
-      <w:r>
-        <w:rPr>
-          <w:b w:val="0"/>
-          <w:i w:val="0"/>
-          <w:sz w:val="20"/>
-        </w:rPr>
-        <w:t>A pre-packaged kit of one or more parts shipped as a single unit, carrying a QR code on its packaging to make reordering easy.</w:t>
+        <w:t>The 29 parts scanned more than once tell us where the codes are being used most. These are good candidates for follow-up — better labeling, better reorder prompts, or new packaging formats.</w:t>
       </w:r>
     </w:p>
     <w:sectPr>
       <w:pgSz w:w="12240" w:h="15840"/>
-      <w:pgMar w:top="1152" w:right="1296" w:bottom="1152" w:left="1296" w:header="720" w:footer="720" w:gutter="0"/>
+      <w:pgMar w:top="1296" w:right="1440" w:bottom="1296" w:left="1440" w:header="720" w:footer="720" w:gutter="0"/>
       <w:cols w:space="720"/>
       <w:docGrid w:linePitch="360"/>
     </w:sectPr>
@@ -1638,6 +1331,10 @@
     <w:name w:val="Normal"/>
     <w:qFormat/>
     <w:rsid w:val="00FC693F"/>
+    <w:rPr>
+      <w:rFonts w:ascii="Calibri" w:hAnsi="Calibri"/>
+      <w:sz w:val="22"/>
+    </w:rPr>
   </w:style>
   <w:style w:type="paragraph" w:styleId="Header">
     <w:name w:val="header"/>

</xml_diff>

<commit_message>
Clean up Background closer and How we measured it
</commit_message>
<xml_diff>
--- a/QR_Code_Visit_Summary.docx
+++ b/QR_Code_Visit_Summary.docx
@@ -63,7 +63,7 @@
           <w:i w:val="0"/>
           <w:sz w:val="22"/>
         </w:rPr>
-        <w:t>From January 21 to date, there have been 172 customer scans in total. This report looks at who scanned, what they did, and which parts pulled the scans.</w:t>
+        <w:t>172 customers have scanned a Prepack code since launch. Weekly volume is climbing, the customers we can identify lean toward small shops, and a handful of parts are getting scanned repeatedly.</w:t>
       </w:r>
     </w:p>
     <w:p>
@@ -89,7 +89,7 @@
           <w:i w:val="0"/>
           <w:sz w:val="22"/>
         </w:rPr>
-        <w:t>Every Prepack QR code encodes the same URL pattern: the part number in the path and ?mode=qr&amp;codeid=4 as the query string. That signature let us isolate Prepack scans from regular product page traffic.</w:t>
+        <w:t>Every Prepack QR code points to a McMaster.com URL that follows the same format — the part number followed by a short tag (mode=qr&amp;codeid=4) we can search on. We pulled every visit that landed on one of these URLs between January 21 and May 28.</w:t>
       </w:r>
     </w:p>
     <w:p>
@@ -102,44 +102,7 @@
           <w:i w:val="0"/>
           <w:sz w:val="22"/>
         </w:rPr>
-        <w:t>Scan data came from the data warehouse and the interactions graph. Two cleaning passes:</w:t>
-      </w:r>
-    </w:p>
-    <w:p>
-      <w:pPr>
-        <w:pStyle w:val="ListBullet"/>
-        <w:spacing w:after="40"/>
-      </w:pPr>
-      <w:r>
-        <w:rPr>
-          <w:sz w:val="22"/>
-        </w:rPr>
-        <w:t>Internal McMaster-Carr scans were removed (test devices, internal IP ranges, and verification activity).</w:t>
-      </w:r>
-    </w:p>
-    <w:p>
-      <w:pPr>
-        <w:pStyle w:val="ListBullet"/>
-        <w:spacing w:after="40"/>
-      </w:pPr>
-      <w:r>
-        <w:rPr>
-          <w:sz w:val="22"/>
-        </w:rPr>
-        <w:t>Duplicate visits and visits with no recorded actions were dropped.</w:t>
-      </w:r>
-    </w:p>
-    <w:p>
-      <w:pPr>
-        <w:spacing w:before="0" w:after="80"/>
-      </w:pPr>
-      <w:r>
-        <w:rPr>
-          <w:b w:val="0"/>
-          <w:i w:val="0"/>
-          <w:sz w:val="22"/>
-        </w:rPr>
-        <w:t>172 unique customer scans remained.</w:t>
+        <w:t>Before counting, we removed internal scans — test devices and McMaster-Carr office IPs used to verify the codes — and dropped visits with no recorded activity. That left 172 customer scans.</w:t>
       </w:r>
     </w:p>
     <w:p>

</xml_diff>

<commit_message>
Tighten language pass: title, methods, drop seasonal/curious-scan lines
</commit_message>
<xml_diff>
--- a/QR_Code_Visit_Summary.docx
+++ b/QR_Code_Visit_Summary.docx
@@ -12,7 +12,7 @@
           <w:sz w:val="32"/>
           <w:u w:val="single"/>
         </w:rPr>
-        <w:t>QR Codes on Prepacks</w:t>
+        <w:t>QR Codes on Prepack Items</w:t>
       </w:r>
     </w:p>
     <w:p>
@@ -24,7 +24,7 @@
           <w:i/>
           <w:sz w:val="22"/>
         </w:rPr>
-        <w:t>January 21 – May 28, 2026   |   172 customer scans</w:t>
+        <w:t>January 21 – May 28, 2026</w:t>
       </w:r>
     </w:p>
     <w:p>
@@ -63,7 +63,7 @@
           <w:i w:val="0"/>
           <w:sz w:val="22"/>
         </w:rPr>
-        <w:t>172 customers have scanned a Prepack code since launch. Weekly volume is climbing, the customers we can identify lean toward small shops, and a handful of parts are getting scanned repeatedly.</w:t>
+        <w:t>172 customers have scanned a Prepack code since launch. Weekly volume is climbing, the customers we can identify are reordering exactly the parts the codes were meant to support, and a handful of parts are getting scanned repeatedly.</w:t>
       </w:r>
     </w:p>
     <w:p>
@@ -89,7 +89,7 @@
           <w:i w:val="0"/>
           <w:sz w:val="22"/>
         </w:rPr>
-        <w:t>Every Prepack QR code points to a McMaster.com URL that follows the same format — the part number followed by a short tag (mode=qr&amp;codeid=4) we can search on. We pulled every visit that landed on one of these URLs between January 21 and May 28.</w:t>
+        <w:t>Every Prepack QR code points to a McMaster.com URL with the same format: the part number, followed by a short tag (mode=QR &amp; codeid=4) that identifies it as a Prepack scan. We pulled every visit that landed on one of these URLs between January 21 and May 28.</w:t>
       </w:r>
     </w:p>
     <w:p>
@@ -102,7 +102,7 @@
           <w:i w:val="0"/>
           <w:sz w:val="22"/>
         </w:rPr>
-        <w:t>Before counting, we removed internal scans — test devices and McMaster-Carr office IPs used to verify the codes — and dropped visits with no recorded activity. That left 172 customer scans.</w:t>
+        <w:t>We removed test scans from internal McMaster devices and office IPs that were used to verify the codes. We also dropped visits with no recorded activity. That left 172 customer scans.</w:t>
       </w:r>
     </w:p>
     <w:p>
@@ -128,7 +128,7 @@
           <w:i w:val="0"/>
           <w:sz w:val="22"/>
         </w:rPr>
-        <w:t>Volume grew steadily through the spring. February averaged roughly three scans per week. By May, weekly scans were averaging around seventeen, with a high of twenty-seven the week of May 18.</w:t>
+        <w:t>Volume has grown steadily. February averaged roughly three scans per week. By May, weekly scans were averaging around seventeen, with a high of twenty-seven the week of May 18.</w:t>
       </w:r>
     </w:p>
     <w:p>
@@ -190,7 +190,7 @@
           <w:i w:val="0"/>
           <w:sz w:val="22"/>
         </w:rPr>
-        <w:t>Most customers who scan a QR code aren't logged in at the moment of the scan, so we don't get a clean customer ID for free. To work around this, we matched scans to known customers using three signals: the visitor ID stored in their browser, the session ID McMaster tracks for that visit, and the IP address the scan came from.</w:t>
+        <w:t>Most customers scan without being logged in, so the visit alone doesn't tell us who they are. We matched scans to known customers using two signals: the anonymous visitor ID tied to each visit, and the IP address the scan came from.</w:t>
       </w:r>
     </w:p>
     <w:p>
@@ -203,7 +203,7 @@
           <w:i w:val="0"/>
           <w:sz w:val="22"/>
         </w:rPr>
-        <w:t>Roughly half — 90 of the 172 scans — matched to a known customer this way. Most were small fabrication shops and credit-card buyers. The other half were first-time mobile visitors with no prior account history, or came from residential carrier IPs we couldn't tie to a specific account.</w:t>
+        <w:t>About half — 90 of the 172 scans — matched to a known customer this way. The matches skew toward shops and credit-card buyers reordering specific parts.</w:t>
       </w:r>
     </w:p>
     <w:p>
@@ -229,7 +229,7 @@
           <w:i w:val="0"/>
           <w:sz w:val="22"/>
         </w:rPr>
-        <w:t>Most scans are short. About seven in ten customers land on the part page and leave without further interaction — typical behavior for QR codes in physical environments, where curious or accidental scans happen often.</w:t>
+        <w:t>Most scans are short. About seven in ten customers land on the part page and leave without taking any further action.</w:t>
       </w:r>
     </w:p>
     <w:p>
@@ -242,7 +242,7 @@
           <w:i w:val="0"/>
           <w:sz w:val="22"/>
         </w:rPr>
-        <w:t>The remaining 31% went deeper. They filtered specs, expanded images, opened sibling parts, and revisited the scanned product. Three placed items in their order pad. One downloaded a CAD file.</w:t>
+        <w:t>The remaining 31% went deeper. They filtered specs, expanded images, opened related parts, and came back to the scanned product later in the visit. Three placed items in their order pad. One downloaded a CAD file.</w:t>
       </w:r>
     </w:p>
     <w:tbl>
@@ -458,7 +458,7 @@
           <w:i w:val="0"/>
           <w:sz w:val="22"/>
         </w:rPr>
-        <w:t>92% of scans came from a phone — about 60% iPhone, 40% Android. The remaining 8% came from desktop browsers, typically a customer scanning into their phone and then continuing on a workstation.</w:t>
+        <w:t>92% of scans came from a phone — roughly 60% iPhone and 40% Android. The remaining 8% came from desktop browsers, usually a customer who scanned with their phone and finished the visit on a computer.</w:t>
       </w:r>
     </w:p>
     <w:p>
@@ -484,7 +484,7 @@
           <w:i w:val="0"/>
           <w:sz w:val="22"/>
         </w:rPr>
-        <w:t>Customers scanned 127 different part numbers. Most parts (98 of the 127, or roughly three-quarters) were scanned only once. The parts scanned more than once are the clearest signal that the Prepack QR program is doing what we hoped — landing on a shop floor, getting used to reorder.</w:t>
+        <w:t>Customers scanned 127 different part numbers. About three-quarters (98 of the 127) were scanned only once. The parts that came up more than once are the clearest signal the program is working — codes are sitting on shop floors and getting reused for reorders.</w:t>
       </w:r>
     </w:p>
     <w:tbl>
@@ -882,7 +882,7 @@
         <w:rPr>
           <w:sz w:val="22"/>
         </w:rPr>
-        <w:t>Volume is climbing. Weekly scans are roughly five times higher in May than in February. We expect continued growth as more Prepacks ship.</w:t>
+        <w:t>Volume is climbing. Weekly scans in May ran roughly five times higher than in February. We expect continued growth as more Prepacks ship.</w:t>
       </w:r>
     </w:p>
     <w:p>
@@ -894,7 +894,7 @@
         <w:rPr>
           <w:sz w:val="22"/>
         </w:rPr>
-        <w:t>The customers we can identify are exactly who we hoped to reach — small shops and credit-card buyers reordering specific parts.</w:t>
+        <w:t>The customers we can identify match the use case the codes were designed for — reordering a specific part they already have on hand.</w:t>
       </w:r>
     </w:p>
     <w:p>
@@ -906,7 +906,7 @@
         <w:rPr>
           <w:sz w:val="22"/>
         </w:rPr>
-        <w:t>Most scans are short, which is normal for physical QR codes. The 31% who engage show real purchase intent.</w:t>
+        <w:t>Most scans are short, which is normal. The 31% who go deeper show real purchase intent — spec filtering, image expansion, and items added to the order pad.</w:t>
       </w:r>
     </w:p>
     <w:p>
@@ -918,7 +918,7 @@
         <w:rPr>
           <w:sz w:val="22"/>
         </w:rPr>
-        <w:t>The 29 parts scanned more than once tell us where the codes are being used most. These are good candidates for follow-up — better labeling, better reorder prompts, or new packaging formats.</w:t>
+        <w:t>Twenty-nine parts came up more than once. These are the parts worth a closer look as we think about better labeling, reorder prompts, or new packaging formats.</w:t>
       </w:r>
     </w:p>
     <w:sectPr>

</xml_diff>

<commit_message>
Bold mode=QR & codeid=4
</commit_message>
<xml_diff>
--- a/QR_Code_Visit_Summary.docx
+++ b/QR_Code_Visit_Summary.docx
@@ -81,15 +81,26 @@
     </w:p>
     <w:p>
       <w:pPr>
-        <w:spacing w:before="0" w:after="80"/>
+        <w:spacing w:after="80"/>
       </w:pPr>
       <w:r>
         <w:rPr>
-          <w:b w:val="0"/>
-          <w:i w:val="0"/>
           <w:sz w:val="22"/>
         </w:rPr>
-        <w:t>Every Prepack QR code points to a McMaster.com URL with the same format: the part number, followed by a short tag (mode=QR &amp; codeid=4) that identifies it as a Prepack scan. We pulled every visit that landed on one of these URLs between January 21 and May 28.</w:t>
+        <w:t>Every Prepack QR code points to a McMaster.com URL with the same format: the part number, followed by a short tag (</w:t>
+      </w:r>
+      <w:r>
+        <w:rPr>
+          <w:b/>
+          <w:sz w:val="22"/>
+        </w:rPr>
+        <w:t>mode=QR &amp; codeid=4</w:t>
+      </w:r>
+      <w:r>
+        <w:rPr>
+          <w:sz w:val="22"/>
+        </w:rPr>
+        <w:t>) that identifies it as a Prepack scan. We pulled every visit that landed on one of these URLs between January 21 and May 28.</w:t>
       </w:r>
     </w:p>
     <w:p>

</xml_diff>

<commit_message>
QR scan volume header + weekly range
</commit_message>
<xml_diff>
--- a/QR_Code_Visit_Summary.docx
+++ b/QR_Code_Visit_Summary.docx
@@ -126,7 +126,7 @@
           <w:sz w:val="26"/>
           <w:u w:val="single"/>
         </w:rPr>
-        <w:t>Scan volume</w:t>
+        <w:t>QR scan volume</w:t>
       </w:r>
     </w:p>
     <w:p>
@@ -139,7 +139,7 @@
           <w:i w:val="0"/>
           <w:sz w:val="22"/>
         </w:rPr>
-        <w:t>Volume has grown steadily. February averaged roughly three scans per week. By May, weekly scans were averaging around seventeen, with a high of twenty-seven the week of May 18.</w:t>
+        <w:t>Volume has grown steadily. Weekly scans averaged about 3 in February. By May, weekly scans ranged from 9 to 27, with the high the week of May 18.</w:t>
       </w:r>
     </w:p>
     <w:p>

</xml_diff>

<commit_message>
Strip unsupported inferences from Background, Parts, Takeaways
</commit_message>
<xml_diff>
--- a/QR_Code_Visit_Summary.docx
+++ b/QR_Code_Visit_Summary.docx
@@ -63,7 +63,7 @@
           <w:i w:val="0"/>
           <w:sz w:val="22"/>
         </w:rPr>
-        <w:t>172 customers have scanned a Prepack code since launch. Weekly volume is climbing, the customers we can identify are reordering exactly the parts the codes were meant to support, and a handful of parts are getting scanned repeatedly.</w:t>
+        <w:t>172 customers have scanned a Prepack code since launch. Weekly volume is climbing, about half of scans match to a known customer account, and a handful of parts are getting scanned repeatedly.</w:t>
       </w:r>
     </w:p>
     <w:p>
@@ -495,7 +495,7 @@
           <w:i w:val="0"/>
           <w:sz w:val="22"/>
         </w:rPr>
-        <w:t>Customers scanned 127 different part numbers. About three-quarters (98 of the 127) were scanned only once. The parts that came up more than once are the clearest signal the program is working — codes are sitting on shop floors and getting reused for reorders.</w:t>
+        <w:t>Customers scanned 127 different part numbers. About three-quarters (98 of the 127) were scanned only once. Twenty-nine were scanned more than once.</w:t>
       </w:r>
     </w:p>
     <w:tbl>
@@ -905,7 +905,7 @@
         <w:rPr>
           <w:sz w:val="22"/>
         </w:rPr>
-        <w:t>The customers we can identify match the use case the codes were designed for — reordering a specific part they already have on hand.</w:t>
+        <w:t>About half of scans match to a known customer account.</w:t>
       </w:r>
     </w:p>
     <w:p>
@@ -917,7 +917,7 @@
         <w:rPr>
           <w:sz w:val="22"/>
         </w:rPr>
-        <w:t>Most scans are short, which is normal. The 31% who go deeper show real purchase intent — spec filtering, image expansion, and items added to the order pad.</w:t>
+        <w:t>Most scans are short. The 31% who go deeper engage meaningfully — filtering specs, expanding images, and in some cases adding items to the order pad.</w:t>
       </w:r>
     </w:p>
     <w:p>
@@ -929,7 +929,7 @@
         <w:rPr>
           <w:sz w:val="22"/>
         </w:rPr>
-        <w:t>Twenty-nine parts came up more than once. These are the parts worth a closer look as we think about better labeling, reorder prompts, or new packaging formats.</w:t>
+        <w:t>Twenty-nine parts came up more than once. These are worth a closer look as we think about better labeling, reorder prompts, or new packaging formats.</w:t>
       </w:r>
     </w:p>
     <w:sectPr>

</xml_diff>

<commit_message>
Add Notable visits section with verified facts
</commit_message>
<xml_diff>
--- a/QR_Code_Visit_Summary.docx
+++ b/QR_Code_Visit_Summary.docx
@@ -881,6 +881,136 @@
           <w:sz w:val="26"/>
           <w:u w:val="single"/>
         </w:rPr>
+        <w:t>Notable visits</w:t>
+      </w:r>
+    </w:p>
+    <w:p>
+      <w:pPr>
+        <w:spacing w:before="0" w:after="80"/>
+      </w:pPr>
+      <w:r>
+        <w:rPr>
+          <w:b w:val="0"/>
+          <w:i w:val="0"/>
+          <w:sz w:val="22"/>
+        </w:rPr>
+        <w:t>A few visits stand out for how directly they show the program working as intended.</w:t>
+      </w:r>
+    </w:p>
+    <w:p>
+      <w:pPr>
+        <w:spacing w:before="80" w:after="40"/>
+      </w:pPr>
+      <w:r>
+        <w:rPr>
+          <w:b/>
+          <w:i w:val="0"/>
+          <w:sz w:val="22"/>
+        </w:rPr>
+        <w:t>Norfolk Southern / Henkels &amp; McCoy — visit 6e77d3a6</w:t>
+      </w:r>
+    </w:p>
+    <w:p>
+      <w:pPr>
+        <w:spacing w:before="0" w:after="80"/>
+      </w:pPr>
+      <w:r>
+        <w:rPr>
+          <w:b w:val="0"/>
+          <w:i w:val="0"/>
+          <w:sz w:val="22"/>
+        </w:rPr>
+        <w:t>Customer scanned the code for part 92188A145 (a stainless brass tapping insert) on a mobile device. Within eight minutes, they bumped the quantity to 7, updated the shipping and billing attention fields, and placed an order for $489.11 with same-day delivery. Forty-seven minutes later they came back, searched for "eyebolts," filtered the results down to three matches, and placed a second order for $201.64 under the same PO. Total from one QR scan: $690.75, both orders delivered same day.</w:t>
+      </w:r>
+    </w:p>
+    <w:p>
+      <w:pPr>
+        <w:spacing w:before="160" w:after="40"/>
+      </w:pPr>
+      <w:r>
+        <w:rPr>
+          <w:b/>
+          <w:i w:val="0"/>
+          <w:sz w:val="22"/>
+        </w:rPr>
+        <w:t>Fathom &amp; Form LLC — visit 84e1a820</w:t>
+      </w:r>
+    </w:p>
+    <w:p>
+      <w:pPr>
+        <w:spacing w:before="0" w:after="80"/>
+      </w:pPr>
+      <w:r>
+        <w:rPr>
+          <w:b w:val="0"/>
+          <w:i w:val="0"/>
+          <w:sz w:val="22"/>
+        </w:rPr>
+        <w:t>Customer scanned the code for part 90764A330 and added one unit to their order within five seconds of landing. Same-day pickup was available in Santa Fe Springs.</w:t>
+      </w:r>
+    </w:p>
+    <w:p>
+      <w:pPr>
+        <w:spacing w:before="160" w:after="40"/>
+      </w:pPr>
+      <w:r>
+        <w:rPr>
+          <w:b/>
+          <w:i w:val="0"/>
+          <w:sz w:val="22"/>
+        </w:rPr>
+        <w:t>Unknown customer — visit 074c5848</w:t>
+      </w:r>
+    </w:p>
+    <w:p>
+      <w:pPr>
+        <w:spacing w:before="0" w:after="80"/>
+      </w:pPr>
+      <w:r>
+        <w:rPr>
+          <w:b w:val="0"/>
+          <w:i w:val="0"/>
+          <w:sz w:val="22"/>
+        </w:rPr>
+        <w:t>Customer scanned the code, went straight to Order History, and added part 91251A440 to a new order. A clean reorder flow.</w:t>
+      </w:r>
+    </w:p>
+    <w:p>
+      <w:pPr>
+        <w:spacing w:before="160" w:after="40"/>
+      </w:pPr>
+      <w:r>
+        <w:rPr>
+          <w:b/>
+          <w:i w:val="0"/>
+          <w:sz w:val="22"/>
+        </w:rPr>
+        <w:t>CAD download — visit 48e0af17</w:t>
+      </w:r>
+    </w:p>
+    <w:p>
+      <w:pPr>
+        <w:spacing w:before="0" w:after="80"/>
+      </w:pPr>
+      <w:r>
+        <w:rPr>
+          <w:b w:val="0"/>
+          <w:i w:val="0"/>
+          <w:sz w:val="22"/>
+        </w:rPr>
+        <w:t>Customer scanned the code for part 91812A215 (an extreme-vibration wedge lock washer) and downloaded the CAD file within 25 seconds. Likely an engineering use case rather than a reorder.</w:t>
+      </w:r>
+    </w:p>
+    <w:p>
+      <w:pPr>
+        <w:spacing w:before="280" w:after="80"/>
+      </w:pPr>
+      <w:r>
+        <w:rPr>
+          <w:b/>
+          <w:sz w:val="26"/>
+          <w:u w:val="single"/>
+        </w:rPr>
         <w:t>Takeaways</w:t>
       </w:r>
     </w:p>

</xml_diff>

<commit_message>
Fix Notable visits: full IDs, 'adjusted' not bumped, drop attention-field detail
</commit_message>
<xml_diff>
--- a/QR_Code_Visit_Summary.docx
+++ b/QR_Code_Visit_Summary.docx
@@ -894,7 +894,7 @@
           <w:i w:val="0"/>
           <w:sz w:val="22"/>
         </w:rPr>
-        <w:t>A few visits stand out for how directly they show the program working as intended.</w:t>
+        <w:t>Four visits worth a closer look:</w:t>
       </w:r>
     </w:p>
     <w:p>
@@ -907,7 +907,7 @@
           <w:i w:val="0"/>
           <w:sz w:val="22"/>
         </w:rPr>
-        <w:t>Norfolk Southern / Henkels &amp; McCoy — visit 6e77d3a6</w:t>
+        <w:t>Norfolk Southern / Henkels &amp; McCoy — visit 6e77d3a6918e42b2845a410daa567c3b</w:t>
       </w:r>
     </w:p>
     <w:p>
@@ -920,7 +920,7 @@
           <w:i w:val="0"/>
           <w:sz w:val="22"/>
         </w:rPr>
-        <w:t>Customer scanned the code for part 92188A145 (a stainless brass tapping insert) on a mobile device. Within eight minutes, they bumped the quantity to 7, updated the shipping and billing attention fields, and placed an order for $489.11 with same-day delivery. Forty-seven minutes later they came back, searched for "eyebolts," filtered the results down to three matches, and placed a second order for $201.64 under the same PO. Total from one QR scan: $690.75, both orders delivered same day.</w:t>
+        <w:t>Customer scanned the code for part 92188A145 (a stainless brass tapping insert) on a mobile device. Within eight minutes, they adjusted the quantity to 7 and placed an order for $489.11 with same-day delivery. Forty-seven minutes later they came back, searched for "eyebolts," filtered the results down to three matches, and placed a second order for $201.64 under the same PO. Total from one QR scan: $690.75, both orders delivered same day.</w:t>
       </w:r>
     </w:p>
     <w:p>
@@ -933,7 +933,7 @@
           <w:i w:val="0"/>
           <w:sz w:val="22"/>
         </w:rPr>
-        <w:t>Fathom &amp; Form LLC — visit 84e1a820</w:t>
+        <w:t>Fathom &amp; Form LLC — visit 84e1a820d4b242d0a82961091c4f4043</w:t>
       </w:r>
     </w:p>
     <w:p>
@@ -959,7 +959,7 @@
           <w:i w:val="0"/>
           <w:sz w:val="22"/>
         </w:rPr>
-        <w:t>Unknown customer — visit 074c5848</w:t>
+        <w:t>Unknown customer — visit 074c5848af5345be847a34d202010652</w:t>
       </w:r>
     </w:p>
     <w:p>
@@ -985,7 +985,7 @@
           <w:i w:val="0"/>
           <w:sz w:val="22"/>
         </w:rPr>
-        <w:t>CAD download — visit 48e0af17</w:t>
+        <w:t>CAD download — visit 48e0af17c2974d60b136232fd9f55bff</w:t>
       </w:r>
     </w:p>
     <w:p>

</xml_diff>

<commit_message>
Notable visits: drop Norfolk Southern + second order; preorder framing for Fathom
</commit_message>
<xml_diff>
--- a/QR_Code_Visit_Summary.docx
+++ b/QR_Code_Visit_Summary.docx
@@ -907,7 +907,7 @@
           <w:i w:val="0"/>
           <w:sz w:val="22"/>
         </w:rPr>
-        <w:t>Norfolk Southern / Henkels &amp; McCoy — visit 6e77d3a6918e42b2845a410daa567c3b</w:t>
+        <w:t>Henkels &amp; McCoy — visit 6e77d3a6918e42b2845a410daa567c3b</w:t>
       </w:r>
     </w:p>
     <w:p>
@@ -920,7 +920,7 @@
           <w:i w:val="0"/>
           <w:sz w:val="22"/>
         </w:rPr>
-        <w:t>Customer scanned the code for part 92188A145 (a stainless brass tapping insert) on a mobile device. Within eight minutes, they adjusted the quantity to 7 and placed an order for $489.11 with same-day delivery. Forty-seven minutes later they came back, searched for "eyebolts," filtered the results down to three matches, and placed a second order for $201.64 under the same PO. Total from one QR scan: $690.75, both orders delivered same day.</w:t>
+        <w:t>Customer scanned the code for part 92188A145 (a stainless brass tapping insert) on a mobile device. Within eight minutes, they adjusted the quantity to 7 and placed an order for $489.11 with same-day delivery.</w:t>
       </w:r>
     </w:p>
     <w:p>
@@ -946,7 +946,7 @@
           <w:i w:val="0"/>
           <w:sz w:val="22"/>
         </w:rPr>
-        <w:t>Customer scanned the code for part 90764A330 and added one unit to their order within five seconds of landing. Same-day pickup was available in Santa Fe Springs.</w:t>
+        <w:t>Customer scanned the code for part 90764A330 on May 11 and added one unit to a preorder within five seconds of landing. Same-day pickup was available in Santa Fe Springs.</w:t>
       </w:r>
     </w:p>
     <w:p>

</xml_diff>

<commit_message>
Drop reorder claim, scans→visits in engagement intro
</commit_message>
<xml_diff>
--- a/QR_Code_Visit_Summary.docx
+++ b/QR_Code_Visit_Summary.docx
@@ -214,7 +214,7 @@
           <w:i w:val="0"/>
           <w:sz w:val="22"/>
         </w:rPr>
-        <w:t>About half — 90 of the 172 scans — matched to a known customer this way. The matches skew toward shops and credit-card buyers reordering specific parts.</w:t>
+        <w:t>About half — 90 of the 172 scans — matched to a known customer this way. The matches skew toward shops and credit-card buyers.</w:t>
       </w:r>
     </w:p>
     <w:p>
@@ -240,7 +240,7 @@
           <w:i w:val="0"/>
           <w:sz w:val="22"/>
         </w:rPr>
-        <w:t>Most scans are short. About seven in ten customers land on the part page and leave without taking any further action.</w:t>
+        <w:t>Most visits are short. About seven in ten customers land on the part page and leave without taking any further action.</w:t>
       </w:r>
     </w:p>
     <w:p>

</xml_diff>

<commit_message>
Identify Advance Grinding as customer for visit 074c5848; note placed order
</commit_message>
<xml_diff>
--- a/QR_Code_Visit_Summary.docx
+++ b/QR_Code_Visit_Summary.docx
@@ -959,7 +959,7 @@
           <w:i w:val="0"/>
           <w:sz w:val="22"/>
         </w:rPr>
-        <w:t>Unknown customer — visit 074c5848af5345be847a34d202010652</w:t>
+        <w:t>Advance Grinding Services — visit 074c5848af5345be847a34d202010652</w:t>
       </w:r>
     </w:p>
     <w:p>
@@ -972,7 +972,7 @@
           <w:i w:val="0"/>
           <w:sz w:val="22"/>
         </w:rPr>
-        <w:t>Customer scanned the code, went straight to Order History, and added part 91251A440 to a new order. A clean reorder flow.</w:t>
+        <w:t>Customer scanned the code, went straight to Order History, and placed an order for 6 packs of part 91251A440 totaling $72.90. A clean reorder flow.</w:t>
       </w:r>
     </w:p>
     <w:p>

</xml_diff>

<commit_message>
Takeaways: scans→visits; strip inference from 29-parts bullet
</commit_message>
<xml_diff>
--- a/QR_Code_Visit_Summary.docx
+++ b/QR_Code_Visit_Summary.docx
@@ -1047,7 +1047,7 @@
         <w:rPr>
           <w:sz w:val="22"/>
         </w:rPr>
-        <w:t>Most scans are short. The 31% who go deeper engage meaningfully — filtering specs, expanding images, and in some cases adding items to the order pad.</w:t>
+        <w:t>Most visits are short. The 31% who go deeper engage meaningfully — filtering specs, expanding images, and in some cases adding items to the order pad.</w:t>
       </w:r>
     </w:p>
     <w:p>
@@ -1059,7 +1059,7 @@
         <w:rPr>
           <w:sz w:val="22"/>
         </w:rPr>
-        <w:t>Twenty-nine parts came up more than once. These are worth a closer look as we think about better labeling, reorder prompts, or new packaging formats.</w:t>
+        <w:t>Twenty-nine parts came up more than once.</w:t>
       </w:r>
     </w:p>
     <w:sectPr>

</xml_diff>

<commit_message>
Add Description column to top parts table
</commit_message>
<xml_diff>
--- a/QR_Code_Visit_Summary.docx
+++ b/QR_Code_Visit_Summary.docx
@@ -505,13 +505,14 @@
         <w:tblLook w:firstColumn="1" w:firstRow="1" w:lastColumn="0" w:lastRow="0" w:noHBand="0" w:noVBand="1" w:val="04A0"/>
       </w:tblPr>
       <w:tblGrid>
-        <w:gridCol w:w="4680"/>
-        <w:gridCol w:w="4680"/>
+        <w:gridCol w:w="3120"/>
+        <w:gridCol w:w="3120"/>
+        <w:gridCol w:w="3120"/>
       </w:tblGrid>
       <w:tr>
         <w:tc>
           <w:tcPr>
-            <w:tcW w:type="dxa" w:w="4680"/>
+            <w:tcW w:type="dxa" w:w="3120"/>
           </w:tcPr>
           <w:p>
             <w:r/>
@@ -526,7 +527,7 @@
         </w:tc>
         <w:tc>
           <w:tcPr>
-            <w:tcW w:type="dxa" w:w="4680"/>
+            <w:tcW w:type="dxa" w:w="3120"/>
           </w:tcPr>
           <w:p>
             <w:r/>
@@ -539,11 +540,26 @@
             </w:r>
           </w:p>
         </w:tc>
+        <w:tc>
+          <w:tcPr>
+            <w:tcW w:type="dxa" w:w="3120"/>
+          </w:tcPr>
+          <w:p>
+            <w:r/>
+            <w:r>
+              <w:rPr>
+                <w:b/>
+                <w:sz w:val="22"/>
+              </w:rPr>
+              <w:t>Description</w:t>
+            </w:r>
+          </w:p>
+        </w:tc>
       </w:tr>
       <w:tr>
         <w:tc>
           <w:tcPr>
-            <w:tcW w:type="dxa" w:w="4680"/>
+            <w:tcW w:type="dxa" w:w="3120"/>
           </w:tcPr>
           <w:p>
             <w:r/>
@@ -557,7 +573,7 @@
         </w:tc>
         <w:tc>
           <w:tcPr>
-            <w:tcW w:type="dxa" w:w="4680"/>
+            <w:tcW w:type="dxa" w:w="3120"/>
           </w:tcPr>
           <w:p>
             <w:r/>
@@ -569,11 +585,25 @@
             </w:r>
           </w:p>
         </w:tc>
+        <w:tc>
+          <w:tcPr>
+            <w:tcW w:type="dxa" w:w="3120"/>
+          </w:tcPr>
+          <w:p>
+            <w:r/>
+            <w:r>
+              <w:rPr>
+                <w:sz w:val="22"/>
+              </w:rPr>
+              <w:t>Black-Oxide Alloy Steel Socket Head Screw, 10-24 Thread Size, 1/2" Long</w:t>
+            </w:r>
+          </w:p>
+        </w:tc>
       </w:tr>
       <w:tr>
         <w:tc>
           <w:tcPr>
-            <w:tcW w:type="dxa" w:w="4680"/>
+            <w:tcW w:type="dxa" w:w="3120"/>
           </w:tcPr>
           <w:p>
             <w:r/>
@@ -587,7 +617,7 @@
         </w:tc>
         <w:tc>
           <w:tcPr>
-            <w:tcW w:type="dxa" w:w="4680"/>
+            <w:tcW w:type="dxa" w:w="3120"/>
           </w:tcPr>
           <w:p>
             <w:r/>
@@ -599,11 +629,25 @@
             </w:r>
           </w:p>
         </w:tc>
+        <w:tc>
+          <w:tcPr>
+            <w:tcW w:type="dxa" w:w="3120"/>
+          </w:tcPr>
+          <w:p>
+            <w:r/>
+            <w:r>
+              <w:rPr>
+                <w:sz w:val="22"/>
+              </w:rPr>
+              <w:t>Zinc Yellow-Chromate-Plated Steel Twist-Resistant Rivet Nut, 3/8"-16 Thread Size, for 0.027" to 0.150" Material Thickness</w:t>
+            </w:r>
+          </w:p>
+        </w:tc>
       </w:tr>
       <w:tr>
         <w:tc>
           <w:tcPr>
-            <w:tcW w:type="dxa" w:w="4680"/>
+            <w:tcW w:type="dxa" w:w="3120"/>
           </w:tcPr>
           <w:p>
             <w:r/>
@@ -617,7 +661,7 @@
         </w:tc>
         <w:tc>
           <w:tcPr>
-            <w:tcW w:type="dxa" w:w="4680"/>
+            <w:tcW w:type="dxa" w:w="3120"/>
           </w:tcPr>
           <w:p>
             <w:r/>
@@ -629,11 +673,25 @@
             </w:r>
           </w:p>
         </w:tc>
+        <w:tc>
+          <w:tcPr>
+            <w:tcW w:type="dxa" w:w="3120"/>
+          </w:tcPr>
+          <w:p>
+            <w:r/>
+            <w:r>
+              <w:rPr>
+                <w:sz w:val="22"/>
+              </w:rPr>
+              <w:t>Element for 100A, 250V AC UL Class H Replaceable-Element Fuse</w:t>
+            </w:r>
+          </w:p>
+        </w:tc>
       </w:tr>
       <w:tr>
         <w:tc>
           <w:tcPr>
-            <w:tcW w:type="dxa" w:w="4680"/>
+            <w:tcW w:type="dxa" w:w="3120"/>
           </w:tcPr>
           <w:p>
             <w:r/>
@@ -647,7 +705,7 @@
         </w:tc>
         <w:tc>
           <w:tcPr>
-            <w:tcW w:type="dxa" w:w="4680"/>
+            <w:tcW w:type="dxa" w:w="3120"/>
           </w:tcPr>
           <w:p>
             <w:r/>
@@ -659,11 +717,24 @@
             </w:r>
           </w:p>
         </w:tc>
+        <w:tc>
+          <w:tcPr>
+            <w:tcW w:type="dxa" w:w="3120"/>
+          </w:tcPr>
+          <w:p>
+            <w:r/>
+            <w:r>
+              <w:rPr>
+                <w:sz w:val="22"/>
+              </w:rPr>
+            </w:r>
+          </w:p>
+        </w:tc>
       </w:tr>
       <w:tr>
         <w:tc>
           <w:tcPr>
-            <w:tcW w:type="dxa" w:w="4680"/>
+            <w:tcW w:type="dxa" w:w="3120"/>
           </w:tcPr>
           <w:p>
             <w:r/>
@@ -677,7 +748,7 @@
         </w:tc>
         <w:tc>
           <w:tcPr>
-            <w:tcW w:type="dxa" w:w="4680"/>
+            <w:tcW w:type="dxa" w:w="3120"/>
           </w:tcPr>
           <w:p>
             <w:r/>
@@ -689,11 +760,24 @@
             </w:r>
           </w:p>
         </w:tc>
+        <w:tc>
+          <w:tcPr>
+            <w:tcW w:type="dxa" w:w="3120"/>
+          </w:tcPr>
+          <w:p>
+            <w:r/>
+            <w:r>
+              <w:rPr>
+                <w:sz w:val="22"/>
+              </w:rPr>
+            </w:r>
+          </w:p>
+        </w:tc>
       </w:tr>
       <w:tr>
         <w:tc>
           <w:tcPr>
-            <w:tcW w:type="dxa" w:w="4680"/>
+            <w:tcW w:type="dxa" w:w="3120"/>
           </w:tcPr>
           <w:p>
             <w:r/>
@@ -707,7 +791,7 @@
         </w:tc>
         <w:tc>
           <w:tcPr>
-            <w:tcW w:type="dxa" w:w="4680"/>
+            <w:tcW w:type="dxa" w:w="3120"/>
           </w:tcPr>
           <w:p>
             <w:r/>
@@ -719,11 +803,24 @@
             </w:r>
           </w:p>
         </w:tc>
+        <w:tc>
+          <w:tcPr>
+            <w:tcW w:type="dxa" w:w="3120"/>
+          </w:tcPr>
+          <w:p>
+            <w:r/>
+            <w:r>
+              <w:rPr>
+                <w:sz w:val="22"/>
+              </w:rPr>
+            </w:r>
+          </w:p>
+        </w:tc>
       </w:tr>
       <w:tr>
         <w:tc>
           <w:tcPr>
-            <w:tcW w:type="dxa" w:w="4680"/>
+            <w:tcW w:type="dxa" w:w="3120"/>
           </w:tcPr>
           <w:p>
             <w:r/>
@@ -737,7 +834,7 @@
         </w:tc>
         <w:tc>
           <w:tcPr>
-            <w:tcW w:type="dxa" w:w="4680"/>
+            <w:tcW w:type="dxa" w:w="3120"/>
           </w:tcPr>
           <w:p>
             <w:r/>
@@ -749,11 +846,24 @@
             </w:r>
           </w:p>
         </w:tc>
+        <w:tc>
+          <w:tcPr>
+            <w:tcW w:type="dxa" w:w="3120"/>
+          </w:tcPr>
+          <w:p>
+            <w:r/>
+            <w:r>
+              <w:rPr>
+                <w:sz w:val="22"/>
+              </w:rPr>
+            </w:r>
+          </w:p>
+        </w:tc>
       </w:tr>
       <w:tr>
         <w:tc>
           <w:tcPr>
-            <w:tcW w:type="dxa" w:w="4680"/>
+            <w:tcW w:type="dxa" w:w="3120"/>
           </w:tcPr>
           <w:p>
             <w:r/>
@@ -767,7 +877,7 @@
         </w:tc>
         <w:tc>
           <w:tcPr>
-            <w:tcW w:type="dxa" w:w="4680"/>
+            <w:tcW w:type="dxa" w:w="3120"/>
           </w:tcPr>
           <w:p>
             <w:r/>
@@ -779,11 +889,24 @@
             </w:r>
           </w:p>
         </w:tc>
+        <w:tc>
+          <w:tcPr>
+            <w:tcW w:type="dxa" w:w="3120"/>
+          </w:tcPr>
+          <w:p>
+            <w:r/>
+            <w:r>
+              <w:rPr>
+                <w:sz w:val="22"/>
+              </w:rPr>
+            </w:r>
+          </w:p>
+        </w:tc>
       </w:tr>
       <w:tr>
         <w:tc>
           <w:tcPr>
-            <w:tcW w:type="dxa" w:w="4680"/>
+            <w:tcW w:type="dxa" w:w="3120"/>
           </w:tcPr>
           <w:p>
             <w:r/>
@@ -797,7 +920,7 @@
         </w:tc>
         <w:tc>
           <w:tcPr>
-            <w:tcW w:type="dxa" w:w="4680"/>
+            <w:tcW w:type="dxa" w:w="3120"/>
           </w:tcPr>
           <w:p>
             <w:r/>
@@ -809,11 +932,24 @@
             </w:r>
           </w:p>
         </w:tc>
+        <w:tc>
+          <w:tcPr>
+            <w:tcW w:type="dxa" w:w="3120"/>
+          </w:tcPr>
+          <w:p>
+            <w:r/>
+            <w:r>
+              <w:rPr>
+                <w:sz w:val="22"/>
+              </w:rPr>
+            </w:r>
+          </w:p>
+        </w:tc>
       </w:tr>
       <w:tr>
         <w:tc>
           <w:tcPr>
-            <w:tcW w:type="dxa" w:w="4680"/>
+            <w:tcW w:type="dxa" w:w="3120"/>
           </w:tcPr>
           <w:p>
             <w:r/>
@@ -827,7 +963,7 @@
         </w:tc>
         <w:tc>
           <w:tcPr>
-            <w:tcW w:type="dxa" w:w="4680"/>
+            <w:tcW w:type="dxa" w:w="3120"/>
           </w:tcPr>
           <w:p>
             <w:r/>
@@ -839,11 +975,24 @@
             </w:r>
           </w:p>
         </w:tc>
+        <w:tc>
+          <w:tcPr>
+            <w:tcW w:type="dxa" w:w="3120"/>
+          </w:tcPr>
+          <w:p>
+            <w:r/>
+            <w:r>
+              <w:rPr>
+                <w:sz w:val="22"/>
+              </w:rPr>
+            </w:r>
+          </w:p>
+        </w:tc>
       </w:tr>
       <w:tr>
         <w:tc>
           <w:tcPr>
-            <w:tcW w:type="dxa" w:w="4680"/>
+            <w:tcW w:type="dxa" w:w="3120"/>
           </w:tcPr>
           <w:p>
             <w:r/>
@@ -857,7 +1006,7 @@
         </w:tc>
         <w:tc>
           <w:tcPr>
-            <w:tcW w:type="dxa" w:w="4680"/>
+            <w:tcW w:type="dxa" w:w="3120"/>
           </w:tcPr>
           <w:p>
             <w:r/>
@@ -866,6 +1015,19 @@
                 <w:sz w:val="22"/>
               </w:rPr>
               <w:t>3</w:t>
+            </w:r>
+          </w:p>
+        </w:tc>
+        <w:tc>
+          <w:tcPr>
+            <w:tcW w:type="dxa" w:w="3120"/>
+          </w:tcPr>
+          <w:p>
+            <w:r/>
+            <w:r>
+              <w:rPr>
+                <w:sz w:val="22"/>
+              </w:rPr>
             </w:r>
           </w:p>
         </w:tc>

</xml_diff>

<commit_message>
Fill all 11 part descriptions in top parts table
</commit_message>
<xml_diff>
--- a/QR_Code_Visit_Summary.docx
+++ b/QR_Code_Visit_Summary.docx
@@ -727,6 +727,7 @@
               <w:rPr>
                 <w:sz w:val="22"/>
               </w:rPr>
+              <w:t>Zinc-Plated Steel Grease Fitting, Straight, 1/8 PTF-SAE Male, 11/16" Overall Height</w:t>
             </w:r>
           </w:p>
         </w:tc>
@@ -770,6 +771,7 @@
               <w:rPr>
                 <w:sz w:val="22"/>
               </w:rPr>
+              <w:t>Medium-Strength Grade 5 Steel Hex Head Screw, Zinc-Plated, 3/8"-16 Thread Size, 1-1/2" Long, Partially Threaded</w:t>
             </w:r>
           </w:p>
         </w:tc>
@@ -813,6 +815,7 @@
               <w:rPr>
                 <w:sz w:val="22"/>
               </w:rPr>
+              <w:t>Medium-Strength Grade 5 Steel Hex Head Screw, Zinc-Plated, 1/4"-20 Thread Size, 1-1/2" Long, Fully Threaded</w:t>
             </w:r>
           </w:p>
         </w:tc>
@@ -856,6 +859,7 @@
               <w:rPr>
                 <w:sz w:val="22"/>
               </w:rPr>
+              <w:t>18-8 Stainless Steel Twist-Resistant Rivet Nut, 5/16"-18 Thread Size, for 0.15" to 0.312" Material Thickness</w:t>
             </w:r>
           </w:p>
         </w:tc>
@@ -899,6 +903,7 @@
               <w:rPr>
                 <w:sz w:val="22"/>
               </w:rPr>
+              <w:t>Medium-Strength Grade 5 Steel Hex Head Screw, Zinc-Plated, 1/4"-20 Thread Size, 1" Long</w:t>
             </w:r>
           </w:p>
         </w:tc>
@@ -942,6 +947,7 @@
               <w:rPr>
                 <w:sz w:val="22"/>
               </w:rPr>
+              <w:t>High-Strength Toggle Anchor for Drywall, Zinc Plated, for 1/4"-20 Thread, 3/8"-3-5/8" Usable Length</w:t>
             </w:r>
           </w:p>
         </w:tc>
@@ -985,6 +991,7 @@
               <w:rPr>
                 <w:sz w:val="22"/>
               </w:rPr>
+              <w:t>Mil. Spec. Phillips Rounded Head Screws, 18-8 Stainless Steel, 8-32 Thread Size, 5/8" Long</w:t>
             </w:r>
           </w:p>
         </w:tc>
@@ -1028,6 +1035,7 @@
               <w:rPr>
                 <w:sz w:val="22"/>
               </w:rPr>
+              <w:t>Lubricated 18-8 Stainless Steel Helical Insert, Screw-Lock, 10-32 Thread Size, 0.380" Installed Length</w:t>
             </w:r>
           </w:p>
         </w:tc>

</xml_diff>

<commit_message>
Add Assortments page with internal-IP filter and April 29 burst flag
</commit_message>
<xml_diff>
--- a/QR_Code_Visit_Summary.docx
+++ b/QR_Code_Visit_Summary.docx
@@ -1172,6 +1172,386 @@
       </w:r>
     </w:p>
     <w:p>
+      <w:r>
+        <w:br w:type="page"/>
+      </w:r>
+    </w:p>
+    <w:p>
+      <w:pPr>
+        <w:spacing w:before="0" w:after="80"/>
+      </w:pPr>
+      <w:r>
+        <w:rPr>
+          <w:b/>
+          <w:sz w:val="26"/>
+          <w:u w:val="single"/>
+        </w:rPr>
+        <w:t>QR Codes on Assortment Items</w:t>
+      </w:r>
+    </w:p>
+    <w:p>
+      <w:pPr>
+        <w:spacing w:before="0" w:after="80"/>
+      </w:pPr>
+      <w:r>
+        <w:rPr>
+          <w:b w:val="0"/>
+          <w:i w:val="0"/>
+          <w:sz w:val="22"/>
+        </w:rPr>
+        <w:t>Product also added QR codes to three assortment kits earlier this year. These codes use a different tag (mode=QR &amp; codeid=2) than the Prepack codes. Each kit has 13 parts: a master part number and twelve components.</w:t>
+      </w:r>
+    </w:p>
+    <w:p>
+      <w:pPr>
+        <w:spacing w:before="80" w:after="40"/>
+      </w:pPr>
+      <w:r>
+        <w:rPr>
+          <w:b w:val="0"/>
+          <w:i w:val="0"/>
+          <w:sz w:val="22"/>
+        </w:rPr>
+        <w:t>The three assortments:</w:t>
+      </w:r>
+    </w:p>
+    <w:p>
+      <w:pPr>
+        <w:pStyle w:val="ListBullet"/>
+        <w:spacing w:after="40"/>
+      </w:pPr>
+      <w:r>
+        <w:rPr>
+          <w:sz w:val="22"/>
+        </w:rPr>
+        <w:t>Assortment 1 — master 94723A110</w:t>
+      </w:r>
+    </w:p>
+    <w:p>
+      <w:pPr>
+        <w:pStyle w:val="ListBullet"/>
+        <w:spacing w:after="40"/>
+      </w:pPr>
+      <w:r>
+        <w:rPr>
+          <w:sz w:val="22"/>
+        </w:rPr>
+        <w:t>Assortment 2 — master 94568A110</w:t>
+      </w:r>
+    </w:p>
+    <w:p>
+      <w:pPr>
+        <w:pStyle w:val="ListBullet"/>
+        <w:spacing w:after="40"/>
+      </w:pPr>
+      <w:r>
+        <w:rPr>
+          <w:sz w:val="22"/>
+        </w:rPr>
+        <w:t>Assortment 3 — master 94451A110</w:t>
+      </w:r>
+    </w:p>
+    <w:p>
+      <w:pPr>
+        <w:spacing w:before="0" w:after="80"/>
+      </w:pPr>
+      <w:r>
+        <w:rPr>
+          <w:b w:val="0"/>
+          <w:i w:val="0"/>
+          <w:sz w:val="22"/>
+        </w:rPr>
+        <w:t>Customer engagement on the assortment codes is much lower than on the Prepack codes. After filtering out scans from our internal IP address (50.233.58.1), real customer activity drops to a handful of scans across the three kits combined.</w:t>
+      </w:r>
+    </w:p>
+    <w:p>
+      <w:pPr>
+        <w:spacing w:before="0" w:after="80"/>
+      </w:pPr>
+      <w:r>
+        <w:rPr>
+          <w:b w:val="0"/>
+          <w:i w:val="0"/>
+          <w:sz w:val="22"/>
+        </w:rPr>
+        <w:t>A cluster of scans on April 29 — fourteen different components scanned in a two-minute window from rotating IPs on the same Android device — looks like automated test traffic and is worth flagging separately.</w:t>
+      </w:r>
+    </w:p>
+    <w:tbl>
+      <w:tblPr>
+        <w:tblStyle w:val="TableGrid"/>
+        <w:tblW w:type="auto" w:w="0"/>
+        <w:tblLook w:firstColumn="1" w:firstRow="1" w:lastColumn="0" w:lastRow="0" w:noHBand="0" w:noVBand="1" w:val="04A0"/>
+      </w:tblPr>
+      <w:tblGrid>
+        <w:gridCol w:w="2340"/>
+        <w:gridCol w:w="2340"/>
+        <w:gridCol w:w="2340"/>
+        <w:gridCol w:w="2340"/>
+      </w:tblGrid>
+      <w:tr>
+        <w:tc>
+          <w:tcPr>
+            <w:tcW w:type="dxa" w:w="2340"/>
+          </w:tcPr>
+          <w:p>
+            <w:r/>
+            <w:r>
+              <w:rPr>
+                <w:b/>
+                <w:sz w:val="22"/>
+              </w:rPr>
+              <w:t>Assortment</w:t>
+            </w:r>
+          </w:p>
+        </w:tc>
+        <w:tc>
+          <w:tcPr>
+            <w:tcW w:type="dxa" w:w="2340"/>
+          </w:tcPr>
+          <w:p>
+            <w:r/>
+            <w:r>
+              <w:rPr>
+                <w:b/>
+                <w:sz w:val="22"/>
+              </w:rPr>
+              <w:t>Master part</w:t>
+            </w:r>
+          </w:p>
+        </w:tc>
+        <w:tc>
+          <w:tcPr>
+            <w:tcW w:type="dxa" w:w="2340"/>
+          </w:tcPr>
+          <w:p>
+            <w:r/>
+            <w:r>
+              <w:rPr>
+                <w:b/>
+                <w:sz w:val="22"/>
+              </w:rPr>
+              <w:t>Total scans</w:t>
+            </w:r>
+          </w:p>
+        </w:tc>
+        <w:tc>
+          <w:tcPr>
+            <w:tcW w:type="dxa" w:w="2340"/>
+          </w:tcPr>
+          <w:p>
+            <w:r/>
+            <w:r>
+              <w:rPr>
+                <w:b/>
+                <w:sz w:val="22"/>
+              </w:rPr>
+              <w:t>After internal-IP filter</w:t>
+            </w:r>
+          </w:p>
+        </w:tc>
+      </w:tr>
+      <w:tr>
+        <w:tc>
+          <w:tcPr>
+            <w:tcW w:type="dxa" w:w="2340"/>
+          </w:tcPr>
+          <w:p>
+            <w:r/>
+            <w:r>
+              <w:rPr>
+                <w:sz w:val="22"/>
+              </w:rPr>
+              <w:t>A1</w:t>
+            </w:r>
+          </w:p>
+        </w:tc>
+        <w:tc>
+          <w:tcPr>
+            <w:tcW w:type="dxa" w:w="2340"/>
+          </w:tcPr>
+          <w:p>
+            <w:r/>
+            <w:r>
+              <w:rPr>
+                <w:sz w:val="22"/>
+              </w:rPr>
+              <w:t>94723A110</w:t>
+            </w:r>
+          </w:p>
+        </w:tc>
+        <w:tc>
+          <w:tcPr>
+            <w:tcW w:type="dxa" w:w="2340"/>
+          </w:tcPr>
+          <w:p>
+            <w:r/>
+            <w:r>
+              <w:rPr>
+                <w:sz w:val="22"/>
+              </w:rPr>
+              <w:t>22</w:t>
+            </w:r>
+          </w:p>
+        </w:tc>
+        <w:tc>
+          <w:tcPr>
+            <w:tcW w:type="dxa" w:w="2340"/>
+          </w:tcPr>
+          <w:p>
+            <w:r/>
+            <w:r>
+              <w:rPr>
+                <w:sz w:val="22"/>
+              </w:rPr>
+              <w:t>~1</w:t>
+            </w:r>
+          </w:p>
+        </w:tc>
+      </w:tr>
+      <w:tr>
+        <w:tc>
+          <w:tcPr>
+            <w:tcW w:type="dxa" w:w="2340"/>
+          </w:tcPr>
+          <w:p>
+            <w:r/>
+            <w:r>
+              <w:rPr>
+                <w:sz w:val="22"/>
+              </w:rPr>
+              <w:t>A2</w:t>
+            </w:r>
+          </w:p>
+        </w:tc>
+        <w:tc>
+          <w:tcPr>
+            <w:tcW w:type="dxa" w:w="2340"/>
+          </w:tcPr>
+          <w:p>
+            <w:r/>
+            <w:r>
+              <w:rPr>
+                <w:sz w:val="22"/>
+              </w:rPr>
+              <w:t>94568A110</w:t>
+            </w:r>
+          </w:p>
+        </w:tc>
+        <w:tc>
+          <w:tcPr>
+            <w:tcW w:type="dxa" w:w="2340"/>
+          </w:tcPr>
+          <w:p>
+            <w:r/>
+            <w:r>
+              <w:rPr>
+                <w:sz w:val="22"/>
+              </w:rPr>
+              <w:t>1</w:t>
+            </w:r>
+          </w:p>
+        </w:tc>
+        <w:tc>
+          <w:tcPr>
+            <w:tcW w:type="dxa" w:w="2340"/>
+          </w:tcPr>
+          <w:p>
+            <w:r/>
+            <w:r>
+              <w:rPr>
+                <w:sz w:val="22"/>
+              </w:rPr>
+              <w:t>1</w:t>
+            </w:r>
+          </w:p>
+        </w:tc>
+      </w:tr>
+      <w:tr>
+        <w:tc>
+          <w:tcPr>
+            <w:tcW w:type="dxa" w:w="2340"/>
+          </w:tcPr>
+          <w:p>
+            <w:r/>
+            <w:r>
+              <w:rPr>
+                <w:sz w:val="22"/>
+              </w:rPr>
+              <w:t>A3</w:t>
+            </w:r>
+          </w:p>
+        </w:tc>
+        <w:tc>
+          <w:tcPr>
+            <w:tcW w:type="dxa" w:w="2340"/>
+          </w:tcPr>
+          <w:p>
+            <w:r/>
+            <w:r>
+              <w:rPr>
+                <w:sz w:val="22"/>
+              </w:rPr>
+              <w:t>94451A110</w:t>
+            </w:r>
+          </w:p>
+        </w:tc>
+        <w:tc>
+          <w:tcPr>
+            <w:tcW w:type="dxa" w:w="2340"/>
+          </w:tcPr>
+          <w:p>
+            <w:r/>
+            <w:r>
+              <w:rPr>
+                <w:sz w:val="22"/>
+              </w:rPr>
+              <w:t>36</w:t>
+            </w:r>
+          </w:p>
+        </w:tc>
+        <w:tc>
+          <w:tcPr>
+            <w:tcW w:type="dxa" w:w="2340"/>
+          </w:tcPr>
+          <w:p>
+            <w:r/>
+            <w:r>
+              <w:rPr>
+                <w:sz w:val="22"/>
+              </w:rPr>
+              <w:t>~17 (incl. April 29 burst)</w:t>
+            </w:r>
+          </w:p>
+        </w:tc>
+      </w:tr>
+    </w:tbl>
+    <w:p>
+      <w:pPr>
+        <w:spacing w:before="0" w:after="120"/>
+      </w:pPr>
+      <w:r>
+        <w:rPr>
+          <w:b w:val="0"/>
+          <w:i w:val="0"/>
+          <w:sz w:val="22"/>
+        </w:rPr>
+      </w:r>
+    </w:p>
+    <w:p>
+      <w:pPr>
+        <w:spacing w:before="0" w:after="80"/>
+      </w:pPr>
+      <w:r>
+        <w:rPr>
+          <w:b w:val="0"/>
+          <w:i w:val="0"/>
+          <w:sz w:val="22"/>
+        </w:rPr>
+        <w:t>We don't have a confirmed go-live date for the assortment codes. Kayla Plack led the initiative and can confirm the timeline so we can scope the analysis window appropriately.</w:t>
+      </w:r>
+    </w:p>
+    <w:p>
       <w:pPr>
         <w:spacing w:before="280" w:after="80"/>
       </w:pPr>

</xml_diff>

<commit_message>
Widen parts description col; assortments table post-IP filter only; remove Kayla reference
</commit_message>
<xml_diff>
--- a/QR_Code_Visit_Summary.docx
+++ b/QR_Code_Visit_Summary.docx
@@ -512,7 +512,7 @@
       <w:tr>
         <w:tc>
           <w:tcPr>
-            <w:tcW w:type="dxa" w:w="3120"/>
+            <w:tcW w:type="dxa" w:w="1440"/>
           </w:tcPr>
           <w:p>
             <w:r/>
@@ -527,7 +527,7 @@
         </w:tc>
         <w:tc>
           <w:tcPr>
-            <w:tcW w:type="dxa" w:w="3120"/>
+            <w:tcW w:type="dxa" w:w="864"/>
           </w:tcPr>
           <w:p>
             <w:r/>
@@ -542,7 +542,7 @@
         </w:tc>
         <w:tc>
           <w:tcPr>
-            <w:tcW w:type="dxa" w:w="3120"/>
+            <w:tcW w:type="dxa" w:w="7200"/>
           </w:tcPr>
           <w:p>
             <w:r/>
@@ -559,7 +559,7 @@
       <w:tr>
         <w:tc>
           <w:tcPr>
-            <w:tcW w:type="dxa" w:w="3120"/>
+            <w:tcW w:type="dxa" w:w="1440"/>
           </w:tcPr>
           <w:p>
             <w:r/>
@@ -573,7 +573,7 @@
         </w:tc>
         <w:tc>
           <w:tcPr>
-            <w:tcW w:type="dxa" w:w="3120"/>
+            <w:tcW w:type="dxa" w:w="864"/>
           </w:tcPr>
           <w:p>
             <w:r/>
@@ -587,7 +587,7 @@
         </w:tc>
         <w:tc>
           <w:tcPr>
-            <w:tcW w:type="dxa" w:w="3120"/>
+            <w:tcW w:type="dxa" w:w="7200"/>
           </w:tcPr>
           <w:p>
             <w:r/>
@@ -603,7 +603,7 @@
       <w:tr>
         <w:tc>
           <w:tcPr>
-            <w:tcW w:type="dxa" w:w="3120"/>
+            <w:tcW w:type="dxa" w:w="1440"/>
           </w:tcPr>
           <w:p>
             <w:r/>
@@ -617,7 +617,7 @@
         </w:tc>
         <w:tc>
           <w:tcPr>
-            <w:tcW w:type="dxa" w:w="3120"/>
+            <w:tcW w:type="dxa" w:w="864"/>
           </w:tcPr>
           <w:p>
             <w:r/>
@@ -631,7 +631,7 @@
         </w:tc>
         <w:tc>
           <w:tcPr>
-            <w:tcW w:type="dxa" w:w="3120"/>
+            <w:tcW w:type="dxa" w:w="7200"/>
           </w:tcPr>
           <w:p>
             <w:r/>
@@ -647,7 +647,7 @@
       <w:tr>
         <w:tc>
           <w:tcPr>
-            <w:tcW w:type="dxa" w:w="3120"/>
+            <w:tcW w:type="dxa" w:w="1440"/>
           </w:tcPr>
           <w:p>
             <w:r/>
@@ -661,7 +661,7 @@
         </w:tc>
         <w:tc>
           <w:tcPr>
-            <w:tcW w:type="dxa" w:w="3120"/>
+            <w:tcW w:type="dxa" w:w="864"/>
           </w:tcPr>
           <w:p>
             <w:r/>
@@ -675,7 +675,7 @@
         </w:tc>
         <w:tc>
           <w:tcPr>
-            <w:tcW w:type="dxa" w:w="3120"/>
+            <w:tcW w:type="dxa" w:w="7200"/>
           </w:tcPr>
           <w:p>
             <w:r/>
@@ -691,7 +691,7 @@
       <w:tr>
         <w:tc>
           <w:tcPr>
-            <w:tcW w:type="dxa" w:w="3120"/>
+            <w:tcW w:type="dxa" w:w="1440"/>
           </w:tcPr>
           <w:p>
             <w:r/>
@@ -705,7 +705,7 @@
         </w:tc>
         <w:tc>
           <w:tcPr>
-            <w:tcW w:type="dxa" w:w="3120"/>
+            <w:tcW w:type="dxa" w:w="864"/>
           </w:tcPr>
           <w:p>
             <w:r/>
@@ -719,7 +719,7 @@
         </w:tc>
         <w:tc>
           <w:tcPr>
-            <w:tcW w:type="dxa" w:w="3120"/>
+            <w:tcW w:type="dxa" w:w="7200"/>
           </w:tcPr>
           <w:p>
             <w:r/>
@@ -735,7 +735,7 @@
       <w:tr>
         <w:tc>
           <w:tcPr>
-            <w:tcW w:type="dxa" w:w="3120"/>
+            <w:tcW w:type="dxa" w:w="1440"/>
           </w:tcPr>
           <w:p>
             <w:r/>
@@ -749,7 +749,7 @@
         </w:tc>
         <w:tc>
           <w:tcPr>
-            <w:tcW w:type="dxa" w:w="3120"/>
+            <w:tcW w:type="dxa" w:w="864"/>
           </w:tcPr>
           <w:p>
             <w:r/>
@@ -763,7 +763,7 @@
         </w:tc>
         <w:tc>
           <w:tcPr>
-            <w:tcW w:type="dxa" w:w="3120"/>
+            <w:tcW w:type="dxa" w:w="7200"/>
           </w:tcPr>
           <w:p>
             <w:r/>
@@ -779,7 +779,7 @@
       <w:tr>
         <w:tc>
           <w:tcPr>
-            <w:tcW w:type="dxa" w:w="3120"/>
+            <w:tcW w:type="dxa" w:w="1440"/>
           </w:tcPr>
           <w:p>
             <w:r/>
@@ -793,7 +793,7 @@
         </w:tc>
         <w:tc>
           <w:tcPr>
-            <w:tcW w:type="dxa" w:w="3120"/>
+            <w:tcW w:type="dxa" w:w="864"/>
           </w:tcPr>
           <w:p>
             <w:r/>
@@ -807,7 +807,7 @@
         </w:tc>
         <w:tc>
           <w:tcPr>
-            <w:tcW w:type="dxa" w:w="3120"/>
+            <w:tcW w:type="dxa" w:w="7200"/>
           </w:tcPr>
           <w:p>
             <w:r/>
@@ -823,7 +823,7 @@
       <w:tr>
         <w:tc>
           <w:tcPr>
-            <w:tcW w:type="dxa" w:w="3120"/>
+            <w:tcW w:type="dxa" w:w="1440"/>
           </w:tcPr>
           <w:p>
             <w:r/>
@@ -837,7 +837,7 @@
         </w:tc>
         <w:tc>
           <w:tcPr>
-            <w:tcW w:type="dxa" w:w="3120"/>
+            <w:tcW w:type="dxa" w:w="864"/>
           </w:tcPr>
           <w:p>
             <w:r/>
@@ -851,7 +851,7 @@
         </w:tc>
         <w:tc>
           <w:tcPr>
-            <w:tcW w:type="dxa" w:w="3120"/>
+            <w:tcW w:type="dxa" w:w="7200"/>
           </w:tcPr>
           <w:p>
             <w:r/>
@@ -867,7 +867,7 @@
       <w:tr>
         <w:tc>
           <w:tcPr>
-            <w:tcW w:type="dxa" w:w="3120"/>
+            <w:tcW w:type="dxa" w:w="1440"/>
           </w:tcPr>
           <w:p>
             <w:r/>
@@ -881,7 +881,7 @@
         </w:tc>
         <w:tc>
           <w:tcPr>
-            <w:tcW w:type="dxa" w:w="3120"/>
+            <w:tcW w:type="dxa" w:w="864"/>
           </w:tcPr>
           <w:p>
             <w:r/>
@@ -895,7 +895,7 @@
         </w:tc>
         <w:tc>
           <w:tcPr>
-            <w:tcW w:type="dxa" w:w="3120"/>
+            <w:tcW w:type="dxa" w:w="7200"/>
           </w:tcPr>
           <w:p>
             <w:r/>
@@ -911,7 +911,7 @@
       <w:tr>
         <w:tc>
           <w:tcPr>
-            <w:tcW w:type="dxa" w:w="3120"/>
+            <w:tcW w:type="dxa" w:w="1440"/>
           </w:tcPr>
           <w:p>
             <w:r/>
@@ -925,7 +925,7 @@
         </w:tc>
         <w:tc>
           <w:tcPr>
-            <w:tcW w:type="dxa" w:w="3120"/>
+            <w:tcW w:type="dxa" w:w="864"/>
           </w:tcPr>
           <w:p>
             <w:r/>
@@ -939,7 +939,7 @@
         </w:tc>
         <w:tc>
           <w:tcPr>
-            <w:tcW w:type="dxa" w:w="3120"/>
+            <w:tcW w:type="dxa" w:w="7200"/>
           </w:tcPr>
           <w:p>
             <w:r/>
@@ -955,7 +955,7 @@
       <w:tr>
         <w:tc>
           <w:tcPr>
-            <w:tcW w:type="dxa" w:w="3120"/>
+            <w:tcW w:type="dxa" w:w="1440"/>
           </w:tcPr>
           <w:p>
             <w:r/>
@@ -969,7 +969,7 @@
         </w:tc>
         <w:tc>
           <w:tcPr>
-            <w:tcW w:type="dxa" w:w="3120"/>
+            <w:tcW w:type="dxa" w:w="864"/>
           </w:tcPr>
           <w:p>
             <w:r/>
@@ -983,7 +983,7 @@
         </w:tc>
         <w:tc>
           <w:tcPr>
-            <w:tcW w:type="dxa" w:w="3120"/>
+            <w:tcW w:type="dxa" w:w="7200"/>
           </w:tcPr>
           <w:p>
             <w:r/>
@@ -999,7 +999,7 @@
       <w:tr>
         <w:tc>
           <w:tcPr>
-            <w:tcW w:type="dxa" w:w="3120"/>
+            <w:tcW w:type="dxa" w:w="1440"/>
           </w:tcPr>
           <w:p>
             <w:r/>
@@ -1013,7 +1013,7 @@
         </w:tc>
         <w:tc>
           <w:tcPr>
-            <w:tcW w:type="dxa" w:w="3120"/>
+            <w:tcW w:type="dxa" w:w="864"/>
           </w:tcPr>
           <w:p>
             <w:r/>
@@ -1027,7 +1027,7 @@
         </w:tc>
         <w:tc>
           <w:tcPr>
-            <w:tcW w:type="dxa" w:w="3120"/>
+            <w:tcW w:type="dxa" w:w="7200"/>
           </w:tcPr>
           <w:p>
             <w:r/>
@@ -1284,15 +1284,14 @@
         <w:tblLook w:firstColumn="1" w:firstRow="1" w:lastColumn="0" w:lastRow="0" w:noHBand="0" w:noVBand="1" w:val="04A0"/>
       </w:tblPr>
       <w:tblGrid>
-        <w:gridCol w:w="2340"/>
-        <w:gridCol w:w="2340"/>
-        <w:gridCol w:w="2340"/>
-        <w:gridCol w:w="2340"/>
+        <w:gridCol w:w="3120"/>
+        <w:gridCol w:w="3120"/>
+        <w:gridCol w:w="3120"/>
       </w:tblGrid>
       <w:tr>
         <w:tc>
           <w:tcPr>
-            <w:tcW w:type="dxa" w:w="2340"/>
+            <w:tcW w:type="dxa" w:w="3120"/>
           </w:tcPr>
           <w:p>
             <w:r/>
@@ -1307,7 +1306,7 @@
         </w:tc>
         <w:tc>
           <w:tcPr>
-            <w:tcW w:type="dxa" w:w="2340"/>
+            <w:tcW w:type="dxa" w:w="3120"/>
           </w:tcPr>
           <w:p>
             <w:r/>
@@ -1322,7 +1321,7 @@
         </w:tc>
         <w:tc>
           <w:tcPr>
-            <w:tcW w:type="dxa" w:w="2340"/>
+            <w:tcW w:type="dxa" w:w="3120"/>
           </w:tcPr>
           <w:p>
             <w:r/>
@@ -1331,22 +1330,7 @@
                 <w:b/>
                 <w:sz w:val="22"/>
               </w:rPr>
-              <w:t>Total scans</w:t>
-            </w:r>
-          </w:p>
-        </w:tc>
-        <w:tc>
-          <w:tcPr>
-            <w:tcW w:type="dxa" w:w="2340"/>
-          </w:tcPr>
-          <w:p>
-            <w:r/>
-            <w:r>
-              <w:rPr>
-                <w:b/>
-                <w:sz w:val="22"/>
-              </w:rPr>
-              <w:t>After internal-IP filter</w:t>
+              <w:t>Customer scans</w:t>
             </w:r>
           </w:p>
         </w:tc>
@@ -1354,7 +1338,7 @@
       <w:tr>
         <w:tc>
           <w:tcPr>
-            <w:tcW w:type="dxa" w:w="2340"/>
+            <w:tcW w:type="dxa" w:w="3120"/>
           </w:tcPr>
           <w:p>
             <w:r/>
@@ -1368,7 +1352,7 @@
         </w:tc>
         <w:tc>
           <w:tcPr>
-            <w:tcW w:type="dxa" w:w="2340"/>
+            <w:tcW w:type="dxa" w:w="3120"/>
           </w:tcPr>
           <w:p>
             <w:r/>
@@ -1382,21 +1366,7 @@
         </w:tc>
         <w:tc>
           <w:tcPr>
-            <w:tcW w:type="dxa" w:w="2340"/>
-          </w:tcPr>
-          <w:p>
-            <w:r/>
-            <w:r>
-              <w:rPr>
-                <w:sz w:val="22"/>
-              </w:rPr>
-              <w:t>22</w:t>
-            </w:r>
-          </w:p>
-        </w:tc>
-        <w:tc>
-          <w:tcPr>
-            <w:tcW w:type="dxa" w:w="2340"/>
+            <w:tcW w:type="dxa" w:w="3120"/>
           </w:tcPr>
           <w:p>
             <w:r/>
@@ -1412,7 +1382,7 @@
       <w:tr>
         <w:tc>
           <w:tcPr>
-            <w:tcW w:type="dxa" w:w="2340"/>
+            <w:tcW w:type="dxa" w:w="3120"/>
           </w:tcPr>
           <w:p>
             <w:r/>
@@ -1426,7 +1396,7 @@
         </w:tc>
         <w:tc>
           <w:tcPr>
-            <w:tcW w:type="dxa" w:w="2340"/>
+            <w:tcW w:type="dxa" w:w="3120"/>
           </w:tcPr>
           <w:p>
             <w:r/>
@@ -1440,21 +1410,7 @@
         </w:tc>
         <w:tc>
           <w:tcPr>
-            <w:tcW w:type="dxa" w:w="2340"/>
-          </w:tcPr>
-          <w:p>
-            <w:r/>
-            <w:r>
-              <w:rPr>
-                <w:sz w:val="22"/>
-              </w:rPr>
-              <w:t>1</w:t>
-            </w:r>
-          </w:p>
-        </w:tc>
-        <w:tc>
-          <w:tcPr>
-            <w:tcW w:type="dxa" w:w="2340"/>
+            <w:tcW w:type="dxa" w:w="3120"/>
           </w:tcPr>
           <w:p>
             <w:r/>
@@ -1470,7 +1426,7 @@
       <w:tr>
         <w:tc>
           <w:tcPr>
-            <w:tcW w:type="dxa" w:w="2340"/>
+            <w:tcW w:type="dxa" w:w="3120"/>
           </w:tcPr>
           <w:p>
             <w:r/>
@@ -1484,7 +1440,7 @@
         </w:tc>
         <w:tc>
           <w:tcPr>
-            <w:tcW w:type="dxa" w:w="2340"/>
+            <w:tcW w:type="dxa" w:w="3120"/>
           </w:tcPr>
           <w:p>
             <w:r/>
@@ -1498,21 +1454,7 @@
         </w:tc>
         <w:tc>
           <w:tcPr>
-            <w:tcW w:type="dxa" w:w="2340"/>
-          </w:tcPr>
-          <w:p>
-            <w:r/>
-            <w:r>
-              <w:rPr>
-                <w:sz w:val="22"/>
-              </w:rPr>
-              <w:t>36</w:t>
-            </w:r>
-          </w:p>
-        </w:tc>
-        <w:tc>
-          <w:tcPr>
-            <w:tcW w:type="dxa" w:w="2340"/>
+            <w:tcW w:type="dxa" w:w="3120"/>
           </w:tcPr>
           <w:p>
             <w:r/>
@@ -1548,7 +1490,7 @@
           <w:i w:val="0"/>
           <w:sz w:val="22"/>
         </w:rPr>
-        <w:t>We don't have a confirmed go-live date for the assortment codes. Kayla Plack led the initiative and can confirm the timeline so we can scope the analysis window appropriately.</w:t>
+        <w:t>We do not yet have a confirmed go-live date for the assortment codes. Once that is confirmed, we can scope the analysis window appropriately and revisit the engagement read.</w:t>
       </w:r>
     </w:p>
     <w:p>

</xml_diff>

<commit_message>
Extend QR scan analysis through May 30, 2026
Add 3 May 30 visits missing from prior pull (91578a863 x2, 92865a133 x1)
and refresh chart + summary doc figures: 175 scans total, 129 distinct
parts, 51% match rate, 94% mobile share.
</commit_message>
<xml_diff>
--- a/QR_Code_Visit_Summary.docx
+++ b/QR_Code_Visit_Summary.docx
@@ -24,7 +24,7 @@
           <w:i/>
           <w:sz w:val="22"/>
         </w:rPr>
-        <w:t>January 21 – May 28, 2026</w:t>
+        <w:t>January 21 – May 30, 2026</w:t>
       </w:r>
     </w:p>
     <w:p>
@@ -63,7 +63,7 @@
           <w:i w:val="0"/>
           <w:sz w:val="22"/>
         </w:rPr>
-        <w:t>172 customers have scanned a Prepack code since launch. Weekly volume is climbing, about half of scans match to a known customer account, and a handful of parts are getting scanned repeatedly.</w:t>
+        <w:t>175 customers have scanned a Prepack code since launch. Weekly volume is climbing, about half of scans match to a known customer account, and a handful of parts are getting scanned repeatedly.</w:t>
       </w:r>
     </w:p>
     <w:p>
@@ -100,7 +100,7 @@
         <w:rPr>
           <w:sz w:val="22"/>
         </w:rPr>
-        <w:t>) that identifies it as a Prepack scan. We pulled every visit that landed on one of these URLs between January 21 and May 28.</w:t>
+        <w:t>) that identifies it as a Prepack scan. We pulled every visit that landed on one of these URLs between January 21 and May 30.</w:t>
       </w:r>
     </w:p>
     <w:p>
@@ -113,7 +113,7 @@
           <w:i w:val="0"/>
           <w:sz w:val="22"/>
         </w:rPr>
-        <w:t>We filtered out scans associated with our internal IP addresses. That left 172 customer scans.</w:t>
+        <w:t>We filtered out scans associated with our internal IP addresses. That left 175 customer scans.</w:t>
       </w:r>
     </w:p>
     <w:p>
@@ -139,14 +139,14 @@
           <w:i w:val="0"/>
           <w:sz w:val="22"/>
         </w:rPr>
-        <w:t>Volume has grown steadily. Weekly scans averaged about 3 in February. By May, weekly scans ranged from 9 to 27, with the high the week of May 18.</w:t>
+        <w:t>Volume has grown steadily. Weekly scans averaged about 3 in February. By May, weekly scans ranged from 12 to 27, with the high the week of May 18.</w:t>
       </w:r>
     </w:p>
     <w:p>
       <w:r>
         <w:drawing>
           <wp:inline xmlns:a="http://schemas.openxmlformats.org/drawingml/2006/main" xmlns:pic="http://schemas.openxmlformats.org/drawingml/2006/picture">
-            <wp:extent cx="5943600" cy="2334668"/>
+            <wp:extent cx="5943600" cy="2389132"/>
             <wp:docPr id="1" name="Picture 1"/>
             <wp:cNvGraphicFramePr>
               <a:graphicFrameLocks noChangeAspect="1"/>
@@ -167,7 +167,7 @@
                   <pic:spPr>
                     <a:xfrm>
                       <a:off x="0" y="0"/>
-                      <a:ext cx="5943600" cy="2334668"/>
+                      <a:ext cx="5943600" cy="2389132"/>
                     </a:xfrm>
                     <a:prstGeom prst="rect"/>
                   </pic:spPr>
@@ -214,7 +214,7 @@
           <w:i w:val="0"/>
           <w:sz w:val="22"/>
         </w:rPr>
-        <w:t>About half — 90 of the 172 scans — matched to a known customer this way. The matches skew toward shops and credit-card buyers.</w:t>
+        <w:t>About half — 90 of the 175 scans — matched to a known customer this way. The matches skew toward shops and credit-card buyers.</w:t>
       </w:r>
     </w:p>
     <w:p>
@@ -253,7 +253,7 @@
           <w:i w:val="0"/>
           <w:sz w:val="22"/>
         </w:rPr>
-        <w:t>The remaining 31% went deeper. They filtered specs, expanded images, opened related parts, and came back to the scanned product later in the visit. Three placed items in their order pad. One downloaded a CAD file.</w:t>
+        <w:t>The remaining 30% went deeper. They filtered specs, expanded images, opened related parts, and came back to the scanned product later in the visit. Three placed items in their order pad. One downloaded a CAD file.</w:t>
       </w:r>
     </w:p>
     <w:tbl>
@@ -339,7 +339,7 @@
               <w:rPr>
                 <w:sz w:val="22"/>
               </w:rPr>
-              <w:t>119</w:t>
+              <w:t>122</w:t>
             </w:r>
           </w:p>
         </w:tc>
@@ -353,7 +353,7 @@
               <w:rPr>
                 <w:sz w:val="22"/>
               </w:rPr>
-              <w:t>69%</w:t>
+              <w:t>70%</w:t>
             </w:r>
           </w:p>
         </w:tc>
@@ -397,7 +397,7 @@
               <w:rPr>
                 <w:sz w:val="22"/>
               </w:rPr>
-              <w:t>24%</w:t>
+              <w:t>23%</w:t>
             </w:r>
           </w:p>
         </w:tc>
@@ -469,7 +469,7 @@
           <w:i w:val="0"/>
           <w:sz w:val="22"/>
         </w:rPr>
-        <w:t>92% of scans came from a phone — roughly 60% iPhone and 40% Android. The remaining 8% came from desktop browsers, usually a customer who scanned with their phone and finished the visit on a computer.</w:t>
+        <w:t>94% of scans came from a phone — roughly 60% iPhone and 40% Android. The remaining 6% came from desktop browsers, usually a customer who scanned with their phone and finished the visit on a computer.</w:t>
       </w:r>
     </w:p>
     <w:p>
@@ -495,7 +495,7 @@
           <w:i w:val="0"/>
           <w:sz w:val="22"/>
         </w:rPr>
-        <w:t>Customers scanned 127 different part numbers. About three-quarters (98 of the 127) were scanned only once. Twenty-nine were scanned more than once.</w:t>
+        <w:t>Customers scanned 129 different part numbers. About three-quarters (99 of the 129) were scanned only once. Thirty were scanned more than once.</w:t>
       </w:r>
     </w:p>
     <w:tbl>
@@ -1539,7 +1539,7 @@
         <w:rPr>
           <w:sz w:val="22"/>
         </w:rPr>
-        <w:t>Most visits are short. The 31% who go deeper engage meaningfully — filtering specs, expanding images, and in some cases adding items to the order pad.</w:t>
+        <w:t>Most visits are short. The 30% who go deeper engage meaningfully — filtering specs, expanding images, and in some cases adding items to the order pad.</w:t>
       </w:r>
     </w:p>
     <w:p>
@@ -1551,7 +1551,7 @@
         <w:rPr>
           <w:sz w:val="22"/>
         </w:rPr>
-        <w:t>Twenty-nine parts came up more than once.</w:t>
+        <w:t>Thirty parts came up more than once.</w:t>
       </w:r>
     </w:p>
     <w:sectPr>

</xml_diff>